<commit_message>
docs: add Level 0 and Level 1 DFDs to phase 2 completed SDS
</commit_message>
<xml_diff>
--- a/Documents Phases/FYP Phase 2 Document.docx
+++ b/Documents Phases/FYP Phase 2 Document.docx
@@ -3573,21 +3573,7 @@
         <w:rPr>
           <w:rFonts w:asciiTheme="majorBidi" w:hAnsiTheme="majorBidi" w:cstheme="majorBidi"/>
         </w:rPr>
-        <w:t xml:space="preserve">&lt;Insert Diagram here, </w:t>
-      </w:r>
-      <w:proofErr w:type="gramStart"/>
-      <w:r>
-        <w:rPr>
-          <w:rFonts w:asciiTheme="majorBidi" w:hAnsiTheme="majorBidi" w:cstheme="majorBidi"/>
-        </w:rPr>
-        <w:t>Provide</w:t>
-      </w:r>
-      <w:proofErr w:type="gramEnd"/>
-      <w:r>
-        <w:rPr>
-          <w:rFonts w:asciiTheme="majorBidi" w:hAnsiTheme="majorBidi" w:cstheme="majorBidi"/>
-        </w:rPr>
-        <w:t xml:space="preserve"> a visual map showing the big pieces (Frontend, Backend, Database, External APIs) and how they connect.&gt;</w:t>
+        <w:t>&lt;Insert Diagram here, Provide a visual map showing the big pieces (Frontend, Backend, Database, External APIs) and how they connect.&gt;</w:t>
       </w:r>
     </w:p>
     <w:p>
@@ -3618,21 +3604,7 @@
         <w:rPr>
           <w:rFonts w:asciiTheme="majorBidi" w:hAnsiTheme="majorBidi" w:cstheme="majorBidi"/>
         </w:rPr>
-        <w:t xml:space="preserve">&lt;List each </w:t>
-      </w:r>
-      <w:proofErr w:type="gramStart"/>
-      <w:r>
-        <w:rPr>
-          <w:rFonts w:asciiTheme="majorBidi" w:hAnsiTheme="majorBidi" w:cstheme="majorBidi"/>
-        </w:rPr>
-        <w:t>components</w:t>
-      </w:r>
-      <w:proofErr w:type="gramEnd"/>
-      <w:r>
-        <w:rPr>
-          <w:rFonts w:asciiTheme="majorBidi" w:hAnsiTheme="majorBidi" w:cstheme="majorBidi"/>
-        </w:rPr>
-        <w:t xml:space="preserve"> from your diagram/ system and give it a one-sentence job description&gt;.</w:t>
+        <w:t>&lt;List each components from your diagram/ system and give it a one-sentence job description&gt;.</w:t>
       </w:r>
     </w:p>
     <w:p>
@@ -4489,6 +4461,106 @@
           </w:tcPr>
           <w:p>
             <w:pPr>
+              <w:spacing w:line="240" w:lineRule="auto"/>
+              <w:jc w:val="center"/>
+              <w:rPr>
+                <w:rFonts w:ascii="Times New Roman" w:hAnsi="Times New Roman"/>
+                <w:b/>
+                <w:bCs/>
+              </w:rPr>
+            </w:pPr>
+            <w:r>
+              <w:rPr>
+                <w:rFonts w:ascii="Times New Roman" w:hAnsi="Times New Roman"/>
+                <w:b/>
+                <w:bCs/>
+              </w:rPr>
+              <w:t>US-15</w:t>
+            </w:r>
+          </w:p>
+          <w:p>
+            <w:pPr>
+              <w:spacing w:line="240" w:lineRule="auto"/>
+              <w:jc w:val="center"/>
+              <w:rPr>
+                <w:rFonts w:ascii="Times New Roman" w:hAnsi="Times New Roman"/>
+                <w:b/>
+                <w:bCs/>
+              </w:rPr>
+            </w:pPr>
+          </w:p>
+        </w:tc>
+        <w:tc>
+          <w:tcPr>
+            <w:tcW w:w="2892" w:type="dxa"/>
+          </w:tcPr>
+          <w:p>
+            <w:pPr>
+              <w:spacing w:line="240" w:lineRule="auto"/>
+              <w:rPr>
+                <w:rFonts w:ascii="Times New Roman" w:hAnsi="Times New Roman"/>
+              </w:rPr>
+            </w:pPr>
+            <w:r>
+              <w:rPr>
+                <w:rFonts w:ascii="Times New Roman" w:hAnsi="Times New Roman"/>
+              </w:rPr>
+              <w:t>Notification Module</w:t>
+            </w:r>
+          </w:p>
+          <w:p>
+            <w:pPr>
+              <w:spacing w:line="240" w:lineRule="auto"/>
+              <w:rPr>
+                <w:rFonts w:ascii="Times New Roman" w:hAnsi="Times New Roman"/>
+              </w:rPr>
+            </w:pPr>
+          </w:p>
+        </w:tc>
+        <w:tc>
+          <w:tcPr>
+            <w:tcW w:w="4969" w:type="dxa"/>
+          </w:tcPr>
+          <w:p>
+            <w:pPr>
+              <w:spacing w:line="240" w:lineRule="auto"/>
+              <w:jc w:val="both"/>
+              <w:rPr>
+                <w:rFonts w:ascii="Times New Roman" w:hAnsi="Times New Roman"/>
+                <w:szCs w:val="24"/>
+              </w:rPr>
+            </w:pPr>
+            <w:r>
+              <w:rPr>
+                <w:rFonts w:ascii="Times New Roman" w:hAnsi="Times New Roman"/>
+                <w:szCs w:val="24"/>
+              </w:rPr>
+              <w:t>Distributes alerts (e.g., booking status updates, checkout success) in real time.</w:t>
+            </w:r>
+          </w:p>
+          <w:p>
+            <w:pPr>
+              <w:spacing w:line="240" w:lineRule="auto"/>
+              <w:jc w:val="both"/>
+              <w:rPr>
+                <w:rFonts w:ascii="Times New Roman" w:hAnsi="Times New Roman"/>
+                <w:szCs w:val="24"/>
+              </w:rPr>
+            </w:pPr>
+          </w:p>
+        </w:tc>
+      </w:tr>
+      <w:tr>
+        <w:trPr>
+          <w:tblHeader/>
+          <w:tblCellSpacing w:w="0" w:type="dxa"/>
+        </w:trPr>
+        <w:tc>
+          <w:tcPr>
+            <w:tcW w:w="2065" w:type="dxa"/>
+          </w:tcPr>
+          <w:p>
+            <w:pPr>
               <w:tabs>
                 <w:tab w:val="left" w:pos="510"/>
               </w:tabs>
@@ -4608,17 +4680,65 @@
     </w:p>
     <w:p>
       <w:pPr>
+        <w:pStyle w:val="Heading3"/>
+      </w:pPr>
+      <w:r>
+        <w:t>Authentication &amp; User Management Module</w:t>
+      </w:r>
+    </w:p>
+    <w:p>
+      <w:pPr>
+        <w:rPr>
+          <w:rFonts w:ascii="Times New Roman" w:hAnsi="Times New Roman"/>
+          <w:b/>
+          <w:bCs/>
+        </w:rPr>
+      </w:pPr>
+      <w:r>
+        <w:rPr>
+          <w:rFonts w:ascii="Times New Roman" w:hAnsi="Times New Roman"/>
+          <w:b/>
+          <w:bCs/>
+        </w:rPr>
+        <w:t>Purpose:</w:t>
+      </w:r>
+    </w:p>
+    <w:p>
+      <w:pPr>
+        <w:rPr>
+          <w:rFonts w:ascii="Times New Roman" w:hAnsi="Times New Roman"/>
+          <w:b/>
+          <w:bCs/>
+        </w:rPr>
+      </w:pPr>
+    </w:p>
+    <w:p>
+      <w:r>
+        <w:t>Enforces platform onboarding rules, evaluates credentials, secures user passwords, and handles session validation using stateless headers across both web and mobile client applications.</w:t>
+      </w:r>
+    </w:p>
+    <w:p/>
+    <w:p>
+      <w:pPr>
         <w:pStyle w:val="template"/>
         <w:jc w:val="both"/>
         <w:rPr>
-          <w:rFonts w:asciiTheme="majorBidi" w:hAnsiTheme="majorBidi" w:cstheme="majorBidi"/>
-        </w:rPr>
-      </w:pPr>
-      <w:r>
-        <w:rPr>
-          <w:rFonts w:asciiTheme="majorBidi" w:hAnsiTheme="majorBidi" w:cstheme="majorBidi"/>
-        </w:rPr>
-        <w:t>&lt;Break the big components into smaller sub-modules. Explain what the Authentication, Data Processing, and API Layers specifically do&gt;</w:t>
+          <w:rFonts w:ascii="Times New Roman" w:hAnsi="Times New Roman"/>
+          <w:b/>
+          <w:bCs/>
+          <w:i w:val="0"/>
+          <w:sz w:val="24"/>
+        </w:rPr>
+      </w:pPr>
+      <w:r>
+        <w:rPr>
+          <w:rFonts w:ascii="Times New Roman" w:hAnsi="Times New Roman"/>
+          <w:b/>
+          <w:bCs/>
+          <w:i w:val="0"/>
+          <w:sz w:val="24"/>
+        </w:rPr>
+        <w:t>Sub-Modules &amp; Descriptions</w:t>
       </w:r>
     </w:p>
     <w:p>
@@ -4626,15 +4746,4284 @@
         <w:pStyle w:val="template"/>
         <w:jc w:val="both"/>
         <w:rPr>
-          <w:rFonts w:asciiTheme="majorBidi" w:hAnsiTheme="majorBidi" w:cstheme="majorBidi"/>
-        </w:rPr>
-      </w:pPr>
-      <w:r>
-        <w:rPr>
-          <w:rFonts w:asciiTheme="majorBidi" w:hAnsiTheme="majorBidi" w:cstheme="majorBidi"/>
-        </w:rPr>
-        <w:t>Examples:</w:t>
-      </w:r>
+          <w:rFonts w:ascii="Times" w:hAnsi="Times"/>
+          <w:i w:val="0"/>
+          <w:sz w:val="24"/>
+        </w:rPr>
+      </w:pPr>
+    </w:p>
+    <w:tbl>
+      <w:tblPr>
+        <w:tblStyle w:val="TableGrid"/>
+        <w:tblW w:w="0" w:type="auto"/>
+        <w:tblLook w:val="04A0" w:firstRow="1" w:lastRow="0" w:firstColumn="1" w:lastColumn="0" w:noHBand="0" w:noVBand="1"/>
+      </w:tblPr>
+      <w:tblGrid>
+        <w:gridCol w:w="4963"/>
+        <w:gridCol w:w="4963"/>
+      </w:tblGrid>
+      <w:tr>
+        <w:tc>
+          <w:tcPr>
+            <w:tcW w:w="4963" w:type="dxa"/>
+          </w:tcPr>
+          <w:p>
+            <w:pPr>
+              <w:pStyle w:val="template"/>
+              <w:tabs>
+                <w:tab w:val="left" w:pos="3090"/>
+              </w:tabs>
+              <w:jc w:val="both"/>
+              <w:rPr>
+                <w:rFonts w:asciiTheme="majorBidi" w:hAnsiTheme="majorBidi" w:cstheme="majorBidi"/>
+                <w:b/>
+                <w:bCs/>
+                <w:i w:val="0"/>
+                <w:iCs/>
+                <w:sz w:val="24"/>
+                <w:szCs w:val="24"/>
+              </w:rPr>
+            </w:pPr>
+            <w:r>
+              <w:rPr>
+                <w:rFonts w:asciiTheme="majorBidi" w:hAnsiTheme="majorBidi" w:cstheme="majorBidi"/>
+                <w:b/>
+                <w:bCs/>
+                <w:i w:val="0"/>
+                <w:iCs/>
+                <w:sz w:val="24"/>
+                <w:szCs w:val="24"/>
+              </w:rPr>
+              <w:tab/>
+              <w:t>Sub-Module</w:t>
+            </w:r>
+          </w:p>
+        </w:tc>
+        <w:tc>
+          <w:tcPr>
+            <w:tcW w:w="4963" w:type="dxa"/>
+          </w:tcPr>
+          <w:p>
+            <w:pPr>
+              <w:pStyle w:val="template"/>
+              <w:jc w:val="center"/>
+              <w:rPr>
+                <w:rFonts w:asciiTheme="majorBidi" w:hAnsiTheme="majorBidi" w:cstheme="majorBidi"/>
+                <w:b/>
+                <w:bCs/>
+                <w:i w:val="0"/>
+                <w:iCs/>
+                <w:sz w:val="24"/>
+                <w:szCs w:val="24"/>
+              </w:rPr>
+            </w:pPr>
+            <w:r>
+              <w:rPr>
+                <w:rFonts w:asciiTheme="majorBidi" w:hAnsiTheme="majorBidi" w:cstheme="majorBidi"/>
+                <w:b/>
+                <w:bCs/>
+                <w:i w:val="0"/>
+                <w:iCs/>
+                <w:sz w:val="24"/>
+                <w:szCs w:val="24"/>
+              </w:rPr>
+              <w:t>Functional Description</w:t>
+            </w:r>
+          </w:p>
+        </w:tc>
+      </w:tr>
+      <w:tr>
+        <w:tc>
+          <w:tcPr>
+            <w:tcW w:w="4963" w:type="dxa"/>
+          </w:tcPr>
+          <w:p>
+            <w:pPr>
+              <w:pStyle w:val="template"/>
+              <w:tabs>
+                <w:tab w:val="left" w:pos="2865"/>
+              </w:tabs>
+              <w:rPr>
+                <w:rFonts w:ascii="Times New Roman" w:hAnsi="Times New Roman"/>
+                <w:i w:val="0"/>
+                <w:iCs/>
+                <w:sz w:val="24"/>
+                <w:szCs w:val="24"/>
+              </w:rPr>
+            </w:pPr>
+            <w:proofErr w:type="spellStart"/>
+            <w:r>
+              <w:rPr>
+                <w:rFonts w:ascii="Times New Roman" w:hAnsi="Times New Roman"/>
+                <w:i w:val="0"/>
+                <w:iCs/>
+                <w:sz w:val="24"/>
+                <w:szCs w:val="24"/>
+              </w:rPr>
+              <w:t>RegistrationManager</w:t>
+            </w:r>
+            <w:proofErr w:type="spellEnd"/>
+          </w:p>
+        </w:tc>
+        <w:tc>
+          <w:tcPr>
+            <w:tcW w:w="4963" w:type="dxa"/>
+          </w:tcPr>
+          <w:p>
+            <w:pPr>
+              <w:pStyle w:val="template"/>
+              <w:jc w:val="both"/>
+              <w:rPr>
+                <w:rFonts w:ascii="Times New Roman" w:hAnsi="Times New Roman"/>
+                <w:i w:val="0"/>
+                <w:iCs/>
+                <w:sz w:val="24"/>
+                <w:szCs w:val="24"/>
+              </w:rPr>
+            </w:pPr>
+            <w:r>
+              <w:rPr>
+                <w:rFonts w:ascii="Times New Roman" w:hAnsi="Times New Roman"/>
+                <w:i w:val="0"/>
+                <w:iCs/>
+                <w:sz w:val="24"/>
+                <w:szCs w:val="24"/>
+              </w:rPr>
+              <w:t>Validates incoming registration fields (e.g., name, email, password, role) and creates a new user document collection entry.</w:t>
+            </w:r>
+          </w:p>
+        </w:tc>
+      </w:tr>
+      <w:tr>
+        <w:tc>
+          <w:tcPr>
+            <w:tcW w:w="4963" w:type="dxa"/>
+          </w:tcPr>
+          <w:p>
+            <w:pPr>
+              <w:pStyle w:val="template"/>
+              <w:tabs>
+                <w:tab w:val="left" w:pos="3600"/>
+              </w:tabs>
+              <w:rPr>
+                <w:rFonts w:ascii="Times New Roman" w:hAnsi="Times New Roman"/>
+                <w:i w:val="0"/>
+                <w:iCs/>
+                <w:sz w:val="24"/>
+                <w:szCs w:val="24"/>
+              </w:rPr>
+            </w:pPr>
+            <w:proofErr w:type="spellStart"/>
+            <w:r>
+              <w:rPr>
+                <w:rFonts w:ascii="Times New Roman" w:hAnsi="Times New Roman"/>
+                <w:i w:val="0"/>
+                <w:iCs/>
+                <w:sz w:val="24"/>
+                <w:szCs w:val="24"/>
+              </w:rPr>
+              <w:t>LoginGatekeeper</w:t>
+            </w:r>
+            <w:proofErr w:type="spellEnd"/>
+          </w:p>
+        </w:tc>
+        <w:tc>
+          <w:tcPr>
+            <w:tcW w:w="4963" w:type="dxa"/>
+          </w:tcPr>
+          <w:p>
+            <w:pPr>
+              <w:pStyle w:val="template"/>
+              <w:jc w:val="both"/>
+              <w:rPr>
+                <w:rFonts w:ascii="Times New Roman" w:hAnsi="Times New Roman"/>
+                <w:i w:val="0"/>
+                <w:iCs/>
+                <w:sz w:val="24"/>
+                <w:szCs w:val="24"/>
+              </w:rPr>
+            </w:pPr>
+            <w:r>
+              <w:rPr>
+                <w:rFonts w:ascii="Times New Roman" w:hAnsi="Times New Roman"/>
+                <w:i w:val="0"/>
+                <w:iCs/>
+                <w:sz w:val="24"/>
+                <w:szCs w:val="24"/>
+              </w:rPr>
+              <w:t>Handles secure user and administrator authentication requests, issuing a stateless payload on verified credentials</w:t>
+            </w:r>
+          </w:p>
+        </w:tc>
+      </w:tr>
+      <w:tr>
+        <w:tc>
+          <w:tcPr>
+            <w:tcW w:w="4963" w:type="dxa"/>
+          </w:tcPr>
+          <w:p>
+            <w:pPr>
+              <w:pStyle w:val="template"/>
+              <w:tabs>
+                <w:tab w:val="left" w:pos="3600"/>
+              </w:tabs>
+              <w:jc w:val="both"/>
+              <w:rPr>
+                <w:rFonts w:ascii="Times New Roman" w:hAnsi="Times New Roman"/>
+                <w:i w:val="0"/>
+                <w:iCs/>
+                <w:sz w:val="24"/>
+                <w:szCs w:val="24"/>
+              </w:rPr>
+            </w:pPr>
+            <w:proofErr w:type="spellStart"/>
+            <w:r>
+              <w:rPr>
+                <w:rFonts w:ascii="Times New Roman" w:hAnsi="Times New Roman"/>
+                <w:i w:val="0"/>
+                <w:iCs/>
+                <w:sz w:val="24"/>
+                <w:szCs w:val="24"/>
+              </w:rPr>
+              <w:t>BCryptHasher</w:t>
+            </w:r>
+            <w:proofErr w:type="spellEnd"/>
+          </w:p>
+        </w:tc>
+        <w:tc>
+          <w:tcPr>
+            <w:tcW w:w="4963" w:type="dxa"/>
+          </w:tcPr>
+          <w:p>
+            <w:pPr>
+              <w:pStyle w:val="template"/>
+              <w:jc w:val="both"/>
+              <w:rPr>
+                <w:rFonts w:ascii="Times New Roman" w:hAnsi="Times New Roman"/>
+                <w:i w:val="0"/>
+                <w:iCs/>
+                <w:sz w:val="24"/>
+                <w:szCs w:val="24"/>
+              </w:rPr>
+            </w:pPr>
+            <w:r>
+              <w:rPr>
+                <w:rFonts w:ascii="Times New Roman" w:hAnsi="Times New Roman"/>
+                <w:i w:val="0"/>
+                <w:iCs/>
+                <w:sz w:val="24"/>
+                <w:szCs w:val="24"/>
+              </w:rPr>
+              <w:t>Provides secure cryptographic operations, salting and hashing plaintext passwords before database storage to prevent reverse-engineering.</w:t>
+            </w:r>
+          </w:p>
+        </w:tc>
+      </w:tr>
+      <w:tr>
+        <w:tc>
+          <w:tcPr>
+            <w:tcW w:w="4963" w:type="dxa"/>
+          </w:tcPr>
+          <w:p>
+            <w:pPr>
+              <w:pStyle w:val="template"/>
+              <w:tabs>
+                <w:tab w:val="left" w:pos="3600"/>
+              </w:tabs>
+              <w:jc w:val="both"/>
+              <w:rPr>
+                <w:rFonts w:ascii="Times New Roman" w:hAnsi="Times New Roman"/>
+                <w:i w:val="0"/>
+                <w:iCs/>
+                <w:sz w:val="24"/>
+                <w:szCs w:val="24"/>
+              </w:rPr>
+            </w:pPr>
+            <w:proofErr w:type="spellStart"/>
+            <w:r>
+              <w:rPr>
+                <w:rFonts w:ascii="Times New Roman" w:hAnsi="Times New Roman"/>
+                <w:i w:val="0"/>
+                <w:iCs/>
+                <w:sz w:val="24"/>
+                <w:szCs w:val="24"/>
+              </w:rPr>
+              <w:t>JWTTokenSigner</w:t>
+            </w:r>
+            <w:proofErr w:type="spellEnd"/>
+          </w:p>
+        </w:tc>
+        <w:tc>
+          <w:tcPr>
+            <w:tcW w:w="4963" w:type="dxa"/>
+          </w:tcPr>
+          <w:p>
+            <w:pPr>
+              <w:pStyle w:val="template"/>
+              <w:jc w:val="both"/>
+              <w:rPr>
+                <w:rFonts w:ascii="Times New Roman" w:hAnsi="Times New Roman"/>
+                <w:i w:val="0"/>
+                <w:iCs/>
+                <w:sz w:val="24"/>
+                <w:szCs w:val="24"/>
+              </w:rPr>
+            </w:pPr>
+            <w:r>
+              <w:rPr>
+                <w:rFonts w:ascii="Times New Roman" w:hAnsi="Times New Roman"/>
+                <w:i w:val="0"/>
+                <w:iCs/>
+                <w:sz w:val="24"/>
+                <w:szCs w:val="24"/>
+              </w:rPr>
+              <w:t xml:space="preserve">Generates and cryptographically signs stateless JSON Web Tokens with a dedicated expiration window to authorize future API requests. </w:t>
+            </w:r>
+          </w:p>
+          <w:p>
+            <w:pPr>
+              <w:pStyle w:val="template"/>
+              <w:jc w:val="both"/>
+              <w:rPr>
+                <w:rFonts w:ascii="Times New Roman" w:hAnsi="Times New Roman"/>
+                <w:i w:val="0"/>
+                <w:iCs/>
+                <w:sz w:val="24"/>
+                <w:szCs w:val="24"/>
+              </w:rPr>
+            </w:pPr>
+          </w:p>
+        </w:tc>
+      </w:tr>
+    </w:tbl>
+    <w:p>
+      <w:pPr>
+        <w:pStyle w:val="template"/>
+        <w:jc w:val="both"/>
+        <w:rPr>
+          <w:rFonts w:asciiTheme="majorBidi" w:hAnsiTheme="majorBidi" w:cstheme="majorBidi"/>
+        </w:rPr>
+      </w:pPr>
+    </w:p>
+    <w:p>
+      <w:pPr>
+        <w:pStyle w:val="Heading3"/>
+      </w:pPr>
+      <w:r>
+        <w:rPr>
+          <w:bCs/>
+        </w:rPr>
+        <w:t>Pet Profile Module</w:t>
+      </w:r>
+    </w:p>
+    <w:p>
+      <w:r>
+        <w:rPr>
+          <w:b/>
+          <w:bCs/>
+        </w:rPr>
+        <w:t>Purpose</w:t>
+      </w:r>
+      <w:r>
+        <w:t>:</w:t>
+      </w:r>
+    </w:p>
+    <w:p/>
+    <w:p>
+      <w:r>
+        <w:t>Handles CRUD operations for pet statistics and health profiles.</w:t>
+      </w:r>
+    </w:p>
+    <w:p/>
+    <w:p>
+      <w:pPr>
+        <w:pStyle w:val="template"/>
+        <w:jc w:val="both"/>
+        <w:rPr>
+          <w:rFonts w:ascii="Times New Roman" w:hAnsi="Times New Roman"/>
+          <w:b/>
+          <w:bCs/>
+          <w:i w:val="0"/>
+          <w:sz w:val="24"/>
+        </w:rPr>
+      </w:pPr>
+      <w:r>
+        <w:rPr>
+          <w:rFonts w:ascii="Times New Roman" w:hAnsi="Times New Roman"/>
+          <w:b/>
+          <w:bCs/>
+          <w:i w:val="0"/>
+          <w:sz w:val="24"/>
+        </w:rPr>
+        <w:t>Sub-Modules &amp; Descriptions</w:t>
+      </w:r>
+    </w:p>
+    <w:p>
+      <w:pPr>
+        <w:pStyle w:val="template"/>
+        <w:jc w:val="both"/>
+        <w:rPr>
+          <w:rFonts w:ascii="Times" w:hAnsi="Times"/>
+          <w:i w:val="0"/>
+          <w:sz w:val="24"/>
+        </w:rPr>
+      </w:pPr>
+    </w:p>
+    <w:tbl>
+      <w:tblPr>
+        <w:tblStyle w:val="TableGrid"/>
+        <w:tblW w:w="0" w:type="auto"/>
+        <w:tblLook w:val="04A0" w:firstRow="1" w:lastRow="0" w:firstColumn="1" w:lastColumn="0" w:noHBand="0" w:noVBand="1"/>
+      </w:tblPr>
+      <w:tblGrid>
+        <w:gridCol w:w="4963"/>
+        <w:gridCol w:w="4963"/>
+      </w:tblGrid>
+      <w:tr>
+        <w:tc>
+          <w:tcPr>
+            <w:tcW w:w="4963" w:type="dxa"/>
+          </w:tcPr>
+          <w:p>
+            <w:pPr>
+              <w:pStyle w:val="template"/>
+              <w:tabs>
+                <w:tab w:val="left" w:pos="3090"/>
+              </w:tabs>
+              <w:jc w:val="both"/>
+              <w:rPr>
+                <w:rFonts w:asciiTheme="majorBidi" w:hAnsiTheme="majorBidi" w:cstheme="majorBidi"/>
+                <w:b/>
+                <w:bCs/>
+                <w:i w:val="0"/>
+                <w:iCs/>
+                <w:sz w:val="24"/>
+                <w:szCs w:val="24"/>
+              </w:rPr>
+            </w:pPr>
+            <w:r>
+              <w:rPr>
+                <w:rFonts w:asciiTheme="majorBidi" w:hAnsiTheme="majorBidi" w:cstheme="majorBidi"/>
+                <w:b/>
+                <w:bCs/>
+                <w:i w:val="0"/>
+                <w:iCs/>
+                <w:sz w:val="24"/>
+                <w:szCs w:val="24"/>
+              </w:rPr>
+              <w:tab/>
+              <w:t>Sub-Module</w:t>
+            </w:r>
+          </w:p>
+        </w:tc>
+        <w:tc>
+          <w:tcPr>
+            <w:tcW w:w="4963" w:type="dxa"/>
+          </w:tcPr>
+          <w:p>
+            <w:pPr>
+              <w:pStyle w:val="template"/>
+              <w:jc w:val="center"/>
+              <w:rPr>
+                <w:rFonts w:asciiTheme="majorBidi" w:hAnsiTheme="majorBidi" w:cstheme="majorBidi"/>
+                <w:b/>
+                <w:bCs/>
+                <w:i w:val="0"/>
+                <w:iCs/>
+                <w:sz w:val="24"/>
+                <w:szCs w:val="24"/>
+              </w:rPr>
+            </w:pPr>
+            <w:r>
+              <w:rPr>
+                <w:rFonts w:asciiTheme="majorBidi" w:hAnsiTheme="majorBidi" w:cstheme="majorBidi"/>
+                <w:b/>
+                <w:bCs/>
+                <w:i w:val="0"/>
+                <w:iCs/>
+                <w:sz w:val="24"/>
+                <w:szCs w:val="24"/>
+              </w:rPr>
+              <w:t>Functional Description</w:t>
+            </w:r>
+          </w:p>
+        </w:tc>
+      </w:tr>
+      <w:tr>
+        <w:tc>
+          <w:tcPr>
+            <w:tcW w:w="4963" w:type="dxa"/>
+          </w:tcPr>
+          <w:p>
+            <w:pPr>
+              <w:pStyle w:val="template"/>
+              <w:tabs>
+                <w:tab w:val="left" w:pos="2865"/>
+              </w:tabs>
+              <w:rPr>
+                <w:rFonts w:ascii="Times New Roman" w:hAnsi="Times New Roman"/>
+                <w:i w:val="0"/>
+                <w:iCs/>
+                <w:sz w:val="24"/>
+                <w:szCs w:val="24"/>
+              </w:rPr>
+            </w:pPr>
+            <w:r>
+              <w:rPr>
+                <w:rFonts w:ascii="Times New Roman" w:hAnsi="Times New Roman"/>
+                <w:iCs/>
+                <w:sz w:val="24"/>
+                <w:szCs w:val="24"/>
+              </w:rPr>
+              <w:t xml:space="preserve">Profile Creator </w:t>
+            </w:r>
+          </w:p>
+        </w:tc>
+        <w:tc>
+          <w:tcPr>
+            <w:tcW w:w="4963" w:type="dxa"/>
+          </w:tcPr>
+          <w:p>
+            <w:pPr>
+              <w:pStyle w:val="template"/>
+              <w:tabs>
+                <w:tab w:val="left" w:pos="2865"/>
+              </w:tabs>
+              <w:rPr>
+                <w:rFonts w:ascii="Times New Roman" w:hAnsi="Times New Roman"/>
+                <w:iCs/>
+                <w:sz w:val="24"/>
+                <w:szCs w:val="24"/>
+              </w:rPr>
+            </w:pPr>
+            <w:r>
+              <w:rPr>
+                <w:rFonts w:ascii="Times New Roman" w:hAnsi="Times New Roman"/>
+                <w:iCs/>
+                <w:sz w:val="24"/>
+                <w:szCs w:val="24"/>
+              </w:rPr>
+              <w:t>Saves new pet records including name, species, breed, age, weight, and image links.</w:t>
+            </w:r>
+          </w:p>
+          <w:p>
+            <w:pPr>
+              <w:pStyle w:val="template"/>
+              <w:jc w:val="both"/>
+              <w:rPr>
+                <w:rFonts w:ascii="Times New Roman" w:hAnsi="Times New Roman"/>
+                <w:i w:val="0"/>
+                <w:iCs/>
+                <w:sz w:val="24"/>
+                <w:szCs w:val="24"/>
+              </w:rPr>
+            </w:pPr>
+          </w:p>
+        </w:tc>
+      </w:tr>
+      <w:tr>
+        <w:trPr>
+          <w:trHeight w:val="593"/>
+        </w:trPr>
+        <w:tc>
+          <w:tcPr>
+            <w:tcW w:w="4963" w:type="dxa"/>
+          </w:tcPr>
+          <w:p>
+            <w:pPr>
+              <w:pStyle w:val="template"/>
+              <w:tabs>
+                <w:tab w:val="left" w:pos="3600"/>
+              </w:tabs>
+              <w:rPr>
+                <w:rFonts w:ascii="Times New Roman" w:hAnsi="Times New Roman"/>
+                <w:i w:val="0"/>
+                <w:iCs/>
+                <w:sz w:val="24"/>
+                <w:szCs w:val="24"/>
+              </w:rPr>
+            </w:pPr>
+            <w:r>
+              <w:rPr>
+                <w:rFonts w:ascii="Times New Roman" w:hAnsi="Times New Roman"/>
+                <w:i w:val="0"/>
+                <w:iCs/>
+                <w:sz w:val="24"/>
+                <w:szCs w:val="24"/>
+              </w:rPr>
+              <w:t xml:space="preserve">Profile Editor </w:t>
+            </w:r>
+          </w:p>
+        </w:tc>
+        <w:tc>
+          <w:tcPr>
+            <w:tcW w:w="4963" w:type="dxa"/>
+          </w:tcPr>
+          <w:p>
+            <w:pPr>
+              <w:pStyle w:val="template"/>
+              <w:jc w:val="both"/>
+              <w:rPr>
+                <w:rFonts w:ascii="Times New Roman" w:hAnsi="Times New Roman"/>
+                <w:i w:val="0"/>
+                <w:iCs/>
+                <w:sz w:val="24"/>
+                <w:szCs w:val="24"/>
+              </w:rPr>
+            </w:pPr>
+            <w:r>
+              <w:rPr>
+                <w:rFonts w:ascii="Times New Roman" w:hAnsi="Times New Roman"/>
+                <w:i w:val="0"/>
+                <w:iCs/>
+                <w:sz w:val="24"/>
+                <w:szCs w:val="24"/>
+              </w:rPr>
+              <w:t>Updates profile values when weight, age, or medical details change.</w:t>
+            </w:r>
+          </w:p>
+        </w:tc>
+      </w:tr>
+      <w:tr>
+        <w:tc>
+          <w:tcPr>
+            <w:tcW w:w="4963" w:type="dxa"/>
+          </w:tcPr>
+          <w:p>
+            <w:pPr>
+              <w:pStyle w:val="template"/>
+              <w:tabs>
+                <w:tab w:val="left" w:pos="3600"/>
+              </w:tabs>
+              <w:jc w:val="both"/>
+              <w:rPr>
+                <w:rFonts w:ascii="Times New Roman" w:hAnsi="Times New Roman"/>
+                <w:i w:val="0"/>
+                <w:sz w:val="24"/>
+                <w:szCs w:val="24"/>
+              </w:rPr>
+            </w:pPr>
+            <w:r>
+              <w:rPr>
+                <w:rFonts w:ascii="Times New Roman" w:hAnsi="Times New Roman"/>
+                <w:i w:val="0"/>
+                <w:sz w:val="24"/>
+                <w:szCs w:val="24"/>
+              </w:rPr>
+              <w:t>Profile Remover</w:t>
+            </w:r>
+          </w:p>
+        </w:tc>
+        <w:tc>
+          <w:tcPr>
+            <w:tcW w:w="4963" w:type="dxa"/>
+          </w:tcPr>
+          <w:p>
+            <w:pPr>
+              <w:pStyle w:val="template"/>
+              <w:jc w:val="both"/>
+              <w:rPr>
+                <w:rFonts w:ascii="Times New Roman" w:hAnsi="Times New Roman"/>
+                <w:i w:val="0"/>
+                <w:sz w:val="24"/>
+                <w:szCs w:val="24"/>
+              </w:rPr>
+            </w:pPr>
+            <w:r>
+              <w:rPr>
+                <w:rFonts w:ascii="Times New Roman" w:hAnsi="Times New Roman"/>
+                <w:i w:val="0"/>
+                <w:sz w:val="24"/>
+                <w:szCs w:val="24"/>
+              </w:rPr>
+              <w:t>Removes pet profiles from the active view.</w:t>
+            </w:r>
+          </w:p>
+          <w:p>
+            <w:pPr>
+              <w:pStyle w:val="template"/>
+              <w:jc w:val="both"/>
+              <w:rPr>
+                <w:rFonts w:ascii="Times New Roman" w:hAnsi="Times New Roman"/>
+                <w:i w:val="0"/>
+                <w:sz w:val="24"/>
+                <w:szCs w:val="24"/>
+              </w:rPr>
+            </w:pPr>
+          </w:p>
+        </w:tc>
+      </w:tr>
+    </w:tbl>
+    <w:p/>
+    <w:p/>
+    <w:p/>
+    <w:p>
+      <w:pPr>
+        <w:pStyle w:val="template"/>
+        <w:jc w:val="both"/>
+        <w:rPr>
+          <w:rFonts w:asciiTheme="majorBidi" w:hAnsiTheme="majorBidi" w:cstheme="majorBidi"/>
+        </w:rPr>
+      </w:pPr>
+    </w:p>
+    <w:p>
+      <w:pPr>
+        <w:pStyle w:val="template"/>
+        <w:jc w:val="both"/>
+        <w:rPr>
+          <w:rFonts w:asciiTheme="majorBidi" w:hAnsiTheme="majorBidi" w:cstheme="majorBidi"/>
+        </w:rPr>
+      </w:pPr>
+    </w:p>
+    <w:p>
+      <w:pPr>
+        <w:pStyle w:val="template"/>
+        <w:jc w:val="both"/>
+        <w:rPr>
+          <w:rFonts w:asciiTheme="majorBidi" w:hAnsiTheme="majorBidi" w:cstheme="majorBidi"/>
+        </w:rPr>
+      </w:pPr>
+    </w:p>
+    <w:p>
+      <w:pPr>
+        <w:pStyle w:val="template"/>
+        <w:jc w:val="both"/>
+        <w:rPr>
+          <w:rFonts w:asciiTheme="majorBidi" w:hAnsiTheme="majorBidi" w:cstheme="majorBidi"/>
+        </w:rPr>
+      </w:pPr>
+    </w:p>
+    <w:p>
+      <w:pPr>
+        <w:pStyle w:val="template"/>
+        <w:jc w:val="both"/>
+        <w:rPr>
+          <w:rFonts w:asciiTheme="majorBidi" w:hAnsiTheme="majorBidi" w:cstheme="majorBidi"/>
+        </w:rPr>
+      </w:pPr>
+    </w:p>
+    <w:p>
+      <w:pPr>
+        <w:pStyle w:val="Heading3"/>
+      </w:pPr>
+      <w:r>
+        <w:lastRenderedPageBreak/>
+        <w:t>Marketplace Module</w:t>
+      </w:r>
+    </w:p>
+    <w:p>
+      <w:pPr>
+        <w:rPr>
+          <w:rFonts w:ascii="Times New Roman" w:hAnsi="Times New Roman"/>
+          <w:b/>
+          <w:bCs/>
+        </w:rPr>
+      </w:pPr>
+      <w:r>
+        <w:rPr>
+          <w:rFonts w:ascii="Times New Roman" w:hAnsi="Times New Roman"/>
+          <w:b/>
+          <w:bCs/>
+        </w:rPr>
+        <w:t>Purpose:</w:t>
+      </w:r>
+    </w:p>
+    <w:p/>
+    <w:p>
+      <w:pPr>
+        <w:rPr>
+          <w:rFonts w:ascii="Times New Roman" w:hAnsi="Times New Roman"/>
+        </w:rPr>
+      </w:pPr>
+      <w:r>
+        <w:rPr>
+          <w:rFonts w:ascii="Times New Roman" w:hAnsi="Times New Roman"/>
+        </w:rPr>
+        <w:t>Co</w:t>
+      </w:r>
+      <w:r>
+        <w:rPr>
+          <w:rFonts w:ascii="Times New Roman" w:hAnsi="Times New Roman"/>
+        </w:rPr>
+        <w:t>o</w:t>
+      </w:r>
+      <w:r>
+        <w:rPr>
+          <w:rFonts w:ascii="Times New Roman" w:hAnsi="Times New Roman"/>
+        </w:rPr>
+        <w:t>rdinates pet adoption and sale listings</w:t>
+      </w:r>
+    </w:p>
+    <w:p/>
+    <w:p>
+      <w:pPr>
+        <w:pStyle w:val="template"/>
+        <w:jc w:val="both"/>
+        <w:rPr>
+          <w:rFonts w:ascii="Times New Roman" w:hAnsi="Times New Roman"/>
+          <w:b/>
+          <w:bCs/>
+          <w:i w:val="0"/>
+          <w:sz w:val="24"/>
+        </w:rPr>
+      </w:pPr>
+      <w:r>
+        <w:rPr>
+          <w:rFonts w:ascii="Times New Roman" w:hAnsi="Times New Roman"/>
+          <w:b/>
+          <w:bCs/>
+          <w:i w:val="0"/>
+          <w:sz w:val="24"/>
+        </w:rPr>
+        <w:t>Sub-Modules &amp; Descriptions</w:t>
+      </w:r>
+    </w:p>
+    <w:p>
+      <w:pPr>
+        <w:pStyle w:val="template"/>
+        <w:jc w:val="both"/>
+        <w:rPr>
+          <w:rFonts w:ascii="Times" w:hAnsi="Times"/>
+          <w:i w:val="0"/>
+          <w:sz w:val="24"/>
+        </w:rPr>
+      </w:pPr>
+    </w:p>
+    <w:tbl>
+      <w:tblPr>
+        <w:tblStyle w:val="TableGrid"/>
+        <w:tblW w:w="0" w:type="auto"/>
+        <w:tblLook w:val="04A0" w:firstRow="1" w:lastRow="0" w:firstColumn="1" w:lastColumn="0" w:noHBand="0" w:noVBand="1"/>
+      </w:tblPr>
+      <w:tblGrid>
+        <w:gridCol w:w="4963"/>
+        <w:gridCol w:w="4963"/>
+      </w:tblGrid>
+      <w:tr>
+        <w:trPr>
+          <w:trHeight w:val="323"/>
+        </w:trPr>
+        <w:tc>
+          <w:tcPr>
+            <w:tcW w:w="4963" w:type="dxa"/>
+          </w:tcPr>
+          <w:p>
+            <w:pPr>
+              <w:pStyle w:val="template"/>
+              <w:tabs>
+                <w:tab w:val="left" w:pos="3090"/>
+              </w:tabs>
+              <w:jc w:val="both"/>
+              <w:rPr>
+                <w:rFonts w:asciiTheme="majorBidi" w:hAnsiTheme="majorBidi" w:cstheme="majorBidi"/>
+                <w:b/>
+                <w:bCs/>
+                <w:i w:val="0"/>
+                <w:iCs/>
+                <w:sz w:val="24"/>
+                <w:szCs w:val="24"/>
+              </w:rPr>
+            </w:pPr>
+            <w:r>
+              <w:rPr>
+                <w:rFonts w:asciiTheme="majorBidi" w:hAnsiTheme="majorBidi" w:cstheme="majorBidi"/>
+                <w:b/>
+                <w:bCs/>
+                <w:i w:val="0"/>
+                <w:iCs/>
+                <w:sz w:val="24"/>
+                <w:szCs w:val="24"/>
+              </w:rPr>
+              <w:tab/>
+              <w:t>Sub-Module</w:t>
+            </w:r>
+          </w:p>
+        </w:tc>
+        <w:tc>
+          <w:tcPr>
+            <w:tcW w:w="4963" w:type="dxa"/>
+          </w:tcPr>
+          <w:p>
+            <w:pPr>
+              <w:pStyle w:val="template"/>
+              <w:jc w:val="center"/>
+              <w:rPr>
+                <w:rFonts w:asciiTheme="majorBidi" w:hAnsiTheme="majorBidi" w:cstheme="majorBidi"/>
+                <w:b/>
+                <w:bCs/>
+                <w:i w:val="0"/>
+                <w:iCs/>
+                <w:sz w:val="24"/>
+                <w:szCs w:val="24"/>
+              </w:rPr>
+            </w:pPr>
+            <w:r>
+              <w:rPr>
+                <w:rFonts w:asciiTheme="majorBidi" w:hAnsiTheme="majorBidi" w:cstheme="majorBidi"/>
+                <w:b/>
+                <w:bCs/>
+                <w:i w:val="0"/>
+                <w:iCs/>
+                <w:sz w:val="24"/>
+                <w:szCs w:val="24"/>
+              </w:rPr>
+              <w:t>Functional Description</w:t>
+            </w:r>
+          </w:p>
+        </w:tc>
+      </w:tr>
+      <w:tr>
+        <w:tc>
+          <w:tcPr>
+            <w:tcW w:w="4963" w:type="dxa"/>
+          </w:tcPr>
+          <w:p>
+            <w:pPr>
+              <w:pStyle w:val="template"/>
+              <w:tabs>
+                <w:tab w:val="left" w:pos="2865"/>
+              </w:tabs>
+              <w:rPr>
+                <w:rFonts w:ascii="Times New Roman" w:hAnsi="Times New Roman"/>
+                <w:i w:val="0"/>
+                <w:sz w:val="24"/>
+                <w:szCs w:val="24"/>
+              </w:rPr>
+            </w:pPr>
+            <w:r>
+              <w:rPr>
+                <w:rFonts w:ascii="Times New Roman" w:hAnsi="Times New Roman"/>
+                <w:i w:val="0"/>
+                <w:sz w:val="24"/>
+                <w:szCs w:val="24"/>
+              </w:rPr>
+              <w:t>Listing Creator</w:t>
+            </w:r>
+            <w:r>
+              <w:rPr>
+                <w:rFonts w:ascii="Times New Roman" w:hAnsi="Times New Roman"/>
+                <w:i w:val="0"/>
+                <w:sz w:val="24"/>
+                <w:szCs w:val="24"/>
+              </w:rPr>
+              <w:t xml:space="preserve"> </w:t>
+            </w:r>
+          </w:p>
+        </w:tc>
+        <w:tc>
+          <w:tcPr>
+            <w:tcW w:w="4963" w:type="dxa"/>
+          </w:tcPr>
+          <w:p>
+            <w:pPr>
+              <w:pStyle w:val="template"/>
+              <w:tabs>
+                <w:tab w:val="left" w:pos="2865"/>
+              </w:tabs>
+              <w:rPr>
+                <w:rFonts w:ascii="Times New Roman" w:hAnsi="Times New Roman"/>
+                <w:i w:val="0"/>
+                <w:sz w:val="24"/>
+                <w:szCs w:val="24"/>
+              </w:rPr>
+            </w:pPr>
+            <w:r>
+              <w:rPr>
+                <w:rFonts w:ascii="Times New Roman" w:hAnsi="Times New Roman"/>
+                <w:i w:val="0"/>
+                <w:sz w:val="24"/>
+                <w:szCs w:val="24"/>
+              </w:rPr>
+              <w:t>Validates prices, matches listings to pet profiles, and creates marketplace records.</w:t>
+            </w:r>
+          </w:p>
+          <w:p>
+            <w:pPr>
+              <w:pStyle w:val="template"/>
+              <w:jc w:val="both"/>
+              <w:rPr>
+                <w:rFonts w:ascii="Times New Roman" w:hAnsi="Times New Roman"/>
+                <w:i w:val="0"/>
+                <w:sz w:val="24"/>
+                <w:szCs w:val="24"/>
+              </w:rPr>
+            </w:pPr>
+          </w:p>
+        </w:tc>
+      </w:tr>
+      <w:tr>
+        <w:trPr>
+          <w:trHeight w:val="593"/>
+        </w:trPr>
+        <w:tc>
+          <w:tcPr>
+            <w:tcW w:w="4963" w:type="dxa"/>
+          </w:tcPr>
+          <w:p>
+            <w:pPr>
+              <w:pStyle w:val="template"/>
+              <w:tabs>
+                <w:tab w:val="left" w:pos="3600"/>
+              </w:tabs>
+              <w:rPr>
+                <w:rFonts w:ascii="Times New Roman" w:hAnsi="Times New Roman"/>
+                <w:i w:val="0"/>
+                <w:sz w:val="24"/>
+                <w:szCs w:val="24"/>
+              </w:rPr>
+            </w:pPr>
+            <w:r>
+              <w:rPr>
+                <w:rFonts w:ascii="Times New Roman" w:hAnsi="Times New Roman"/>
+                <w:i w:val="0"/>
+                <w:sz w:val="24"/>
+                <w:szCs w:val="24"/>
+              </w:rPr>
+              <w:t>Feed Viewer</w:t>
+            </w:r>
+            <w:r>
+              <w:rPr>
+                <w:rFonts w:ascii="Times New Roman" w:hAnsi="Times New Roman"/>
+                <w:i w:val="0"/>
+                <w:sz w:val="24"/>
+                <w:szCs w:val="24"/>
+              </w:rPr>
+              <w:t xml:space="preserve"> </w:t>
+            </w:r>
+          </w:p>
+        </w:tc>
+        <w:tc>
+          <w:tcPr>
+            <w:tcW w:w="4963" w:type="dxa"/>
+          </w:tcPr>
+          <w:p>
+            <w:pPr>
+              <w:pStyle w:val="template"/>
+              <w:jc w:val="both"/>
+              <w:rPr>
+                <w:rFonts w:ascii="Times New Roman" w:hAnsi="Times New Roman"/>
+                <w:i w:val="0"/>
+                <w:sz w:val="24"/>
+                <w:szCs w:val="24"/>
+              </w:rPr>
+            </w:pPr>
+            <w:r>
+              <w:rPr>
+                <w:rFonts w:ascii="Times New Roman" w:hAnsi="Times New Roman"/>
+                <w:i w:val="0"/>
+                <w:sz w:val="24"/>
+                <w:szCs w:val="24"/>
+              </w:rPr>
+              <w:t>Fetches listings and sorts them by date and type.</w:t>
+            </w:r>
+          </w:p>
+          <w:p>
+            <w:pPr>
+              <w:pStyle w:val="template"/>
+              <w:jc w:val="both"/>
+              <w:rPr>
+                <w:rFonts w:ascii="Times New Roman" w:hAnsi="Times New Roman"/>
+                <w:i w:val="0"/>
+                <w:sz w:val="24"/>
+                <w:szCs w:val="24"/>
+              </w:rPr>
+            </w:pPr>
+          </w:p>
+        </w:tc>
+      </w:tr>
+      <w:tr>
+        <w:tc>
+          <w:tcPr>
+            <w:tcW w:w="4963" w:type="dxa"/>
+          </w:tcPr>
+          <w:p>
+            <w:pPr>
+              <w:pStyle w:val="template"/>
+              <w:tabs>
+                <w:tab w:val="left" w:pos="3600"/>
+              </w:tabs>
+              <w:jc w:val="both"/>
+              <w:rPr>
+                <w:rFonts w:ascii="Times New Roman" w:hAnsi="Times New Roman"/>
+                <w:i w:val="0"/>
+                <w:sz w:val="24"/>
+                <w:szCs w:val="24"/>
+              </w:rPr>
+            </w:pPr>
+            <w:r>
+              <w:rPr>
+                <w:rFonts w:ascii="Times New Roman" w:hAnsi="Times New Roman"/>
+                <w:i w:val="0"/>
+                <w:sz w:val="24"/>
+                <w:szCs w:val="24"/>
+              </w:rPr>
+              <w:t>Search Filter</w:t>
+            </w:r>
+          </w:p>
+        </w:tc>
+        <w:tc>
+          <w:tcPr>
+            <w:tcW w:w="4963" w:type="dxa"/>
+          </w:tcPr>
+          <w:p>
+            <w:pPr>
+              <w:pStyle w:val="template"/>
+              <w:jc w:val="both"/>
+              <w:rPr>
+                <w:rFonts w:ascii="Times New Roman" w:hAnsi="Times New Roman"/>
+                <w:i w:val="0"/>
+                <w:sz w:val="24"/>
+                <w:szCs w:val="24"/>
+              </w:rPr>
+            </w:pPr>
+            <w:r>
+              <w:rPr>
+                <w:rFonts w:ascii="Times New Roman" w:hAnsi="Times New Roman"/>
+                <w:i w:val="0"/>
+                <w:sz w:val="24"/>
+                <w:szCs w:val="24"/>
+              </w:rPr>
+              <w:t>Performs query operations based on breed, species, location, and price.</w:t>
+            </w:r>
+          </w:p>
+          <w:p>
+            <w:pPr>
+              <w:pStyle w:val="template"/>
+              <w:jc w:val="both"/>
+              <w:rPr>
+                <w:rFonts w:ascii="Times New Roman" w:hAnsi="Times New Roman"/>
+                <w:i w:val="0"/>
+                <w:sz w:val="24"/>
+                <w:szCs w:val="24"/>
+              </w:rPr>
+            </w:pPr>
+          </w:p>
+        </w:tc>
+      </w:tr>
+      <w:tr>
+        <w:tc>
+          <w:tcPr>
+            <w:tcW w:w="4963" w:type="dxa"/>
+          </w:tcPr>
+          <w:p>
+            <w:pPr>
+              <w:pStyle w:val="template"/>
+              <w:tabs>
+                <w:tab w:val="left" w:pos="3600"/>
+              </w:tabs>
+              <w:jc w:val="both"/>
+              <w:rPr>
+                <w:rFonts w:ascii="Times New Roman" w:hAnsi="Times New Roman"/>
+                <w:i w:val="0"/>
+                <w:sz w:val="24"/>
+                <w:szCs w:val="24"/>
+              </w:rPr>
+            </w:pPr>
+            <w:r>
+              <w:rPr>
+                <w:rFonts w:ascii="Times New Roman" w:hAnsi="Times New Roman"/>
+                <w:i w:val="0"/>
+                <w:sz w:val="24"/>
+                <w:szCs w:val="24"/>
+              </w:rPr>
+              <w:t>Listing Status Manager</w:t>
+            </w:r>
+          </w:p>
+        </w:tc>
+        <w:tc>
+          <w:tcPr>
+            <w:tcW w:w="4963" w:type="dxa"/>
+          </w:tcPr>
+          <w:p>
+            <w:pPr>
+              <w:pStyle w:val="template"/>
+              <w:jc w:val="both"/>
+              <w:rPr>
+                <w:rFonts w:ascii="Times New Roman" w:hAnsi="Times New Roman"/>
+                <w:i w:val="0"/>
+                <w:sz w:val="24"/>
+                <w:szCs w:val="24"/>
+              </w:rPr>
+            </w:pPr>
+            <w:r>
+              <w:rPr>
+                <w:rFonts w:ascii="Times New Roman" w:hAnsi="Times New Roman"/>
+                <w:i w:val="0"/>
+                <w:sz w:val="24"/>
+                <w:szCs w:val="24"/>
+              </w:rPr>
+              <w:t>Marks listings as sold, adopted, or inactive.</w:t>
+            </w:r>
+          </w:p>
+          <w:p>
+            <w:pPr>
+              <w:pStyle w:val="template"/>
+              <w:jc w:val="both"/>
+              <w:rPr>
+                <w:rFonts w:ascii="Times New Roman" w:hAnsi="Times New Roman"/>
+                <w:i w:val="0"/>
+                <w:sz w:val="24"/>
+                <w:szCs w:val="24"/>
+              </w:rPr>
+            </w:pPr>
+          </w:p>
+        </w:tc>
+      </w:tr>
+    </w:tbl>
+    <w:p/>
+    <w:p>
+      <w:pPr>
+        <w:pStyle w:val="Heading3"/>
+      </w:pPr>
+      <w:r>
+        <w:t>Shelter Booking Modules</w:t>
+      </w:r>
+    </w:p>
+    <w:p>
+      <w:pPr>
+        <w:rPr>
+          <w:b/>
+          <w:bCs/>
+        </w:rPr>
+      </w:pPr>
+      <w:r>
+        <w:rPr>
+          <w:b/>
+          <w:bCs/>
+        </w:rPr>
+        <w:t>Purpose:</w:t>
+      </w:r>
+    </w:p>
+    <w:p>
+      <w:pPr>
+        <w:rPr>
+          <w:b/>
+          <w:bCs/>
+        </w:rPr>
+      </w:pPr>
+    </w:p>
+    <w:p>
+      <w:r>
+        <w:t>Coordinates boarding bookings between owners and providers</w:t>
+      </w:r>
+    </w:p>
+    <w:p/>
+    <w:p>
+      <w:pPr>
+        <w:pStyle w:val="template"/>
+        <w:jc w:val="both"/>
+        <w:rPr>
+          <w:rFonts w:ascii="Times New Roman" w:hAnsi="Times New Roman"/>
+          <w:b/>
+          <w:bCs/>
+          <w:i w:val="0"/>
+          <w:sz w:val="24"/>
+        </w:rPr>
+      </w:pPr>
+      <w:r>
+        <w:rPr>
+          <w:rFonts w:ascii="Times New Roman" w:hAnsi="Times New Roman"/>
+          <w:b/>
+          <w:bCs/>
+          <w:i w:val="0"/>
+          <w:sz w:val="24"/>
+        </w:rPr>
+        <w:t>Sub-Modules &amp; Descriptions</w:t>
+      </w:r>
+    </w:p>
+    <w:p>
+      <w:pPr>
+        <w:pStyle w:val="template"/>
+        <w:jc w:val="both"/>
+        <w:rPr>
+          <w:rFonts w:ascii="Times" w:hAnsi="Times"/>
+          <w:i w:val="0"/>
+          <w:sz w:val="24"/>
+        </w:rPr>
+      </w:pPr>
+    </w:p>
+    <w:tbl>
+      <w:tblPr>
+        <w:tblStyle w:val="TableGrid"/>
+        <w:tblW w:w="0" w:type="auto"/>
+        <w:tblLook w:val="04A0" w:firstRow="1" w:lastRow="0" w:firstColumn="1" w:lastColumn="0" w:noHBand="0" w:noVBand="1"/>
+      </w:tblPr>
+      <w:tblGrid>
+        <w:gridCol w:w="4963"/>
+        <w:gridCol w:w="4963"/>
+      </w:tblGrid>
+      <w:tr>
+        <w:trPr>
+          <w:trHeight w:val="323"/>
+        </w:trPr>
+        <w:tc>
+          <w:tcPr>
+            <w:tcW w:w="4963" w:type="dxa"/>
+          </w:tcPr>
+          <w:p>
+            <w:pPr>
+              <w:pStyle w:val="template"/>
+              <w:tabs>
+                <w:tab w:val="left" w:pos="3090"/>
+              </w:tabs>
+              <w:jc w:val="both"/>
+              <w:rPr>
+                <w:rFonts w:asciiTheme="majorBidi" w:hAnsiTheme="majorBidi" w:cstheme="majorBidi"/>
+                <w:b/>
+                <w:bCs/>
+                <w:i w:val="0"/>
+                <w:iCs/>
+                <w:sz w:val="24"/>
+                <w:szCs w:val="24"/>
+              </w:rPr>
+            </w:pPr>
+            <w:r>
+              <w:rPr>
+                <w:rFonts w:asciiTheme="majorBidi" w:hAnsiTheme="majorBidi" w:cstheme="majorBidi"/>
+                <w:b/>
+                <w:bCs/>
+                <w:i w:val="0"/>
+                <w:iCs/>
+                <w:sz w:val="24"/>
+                <w:szCs w:val="24"/>
+              </w:rPr>
+              <w:tab/>
+              <w:t>Sub-Module</w:t>
+            </w:r>
+          </w:p>
+        </w:tc>
+        <w:tc>
+          <w:tcPr>
+            <w:tcW w:w="4963" w:type="dxa"/>
+          </w:tcPr>
+          <w:p>
+            <w:pPr>
+              <w:pStyle w:val="template"/>
+              <w:jc w:val="center"/>
+              <w:rPr>
+                <w:rFonts w:asciiTheme="majorBidi" w:hAnsiTheme="majorBidi" w:cstheme="majorBidi"/>
+                <w:b/>
+                <w:bCs/>
+                <w:i w:val="0"/>
+                <w:iCs/>
+                <w:sz w:val="24"/>
+                <w:szCs w:val="24"/>
+              </w:rPr>
+            </w:pPr>
+            <w:r>
+              <w:rPr>
+                <w:rFonts w:asciiTheme="majorBidi" w:hAnsiTheme="majorBidi" w:cstheme="majorBidi"/>
+                <w:b/>
+                <w:bCs/>
+                <w:i w:val="0"/>
+                <w:iCs/>
+                <w:sz w:val="24"/>
+                <w:szCs w:val="24"/>
+              </w:rPr>
+              <w:t>Functional Description</w:t>
+            </w:r>
+          </w:p>
+        </w:tc>
+      </w:tr>
+      <w:tr>
+        <w:tc>
+          <w:tcPr>
+            <w:tcW w:w="4963" w:type="dxa"/>
+          </w:tcPr>
+          <w:p>
+            <w:pPr>
+              <w:pStyle w:val="template"/>
+              <w:tabs>
+                <w:tab w:val="left" w:pos="2865"/>
+              </w:tabs>
+              <w:rPr>
+                <w:rFonts w:ascii="Times New Roman" w:hAnsi="Times New Roman"/>
+                <w:i w:val="0"/>
+                <w:iCs/>
+                <w:sz w:val="24"/>
+                <w:szCs w:val="24"/>
+              </w:rPr>
+            </w:pPr>
+            <w:r>
+              <w:rPr>
+                <w:rFonts w:ascii="Times New Roman" w:hAnsi="Times New Roman"/>
+                <w:i w:val="0"/>
+                <w:iCs/>
+                <w:sz w:val="24"/>
+                <w:szCs w:val="24"/>
+              </w:rPr>
+              <w:t>Booking Creator</w:t>
+            </w:r>
+          </w:p>
+          <w:p>
+            <w:pPr>
+              <w:pStyle w:val="template"/>
+              <w:tabs>
+                <w:tab w:val="left" w:pos="2865"/>
+              </w:tabs>
+              <w:rPr>
+                <w:rFonts w:ascii="Times New Roman" w:hAnsi="Times New Roman"/>
+                <w:i w:val="0"/>
+                <w:iCs/>
+                <w:sz w:val="24"/>
+                <w:szCs w:val="24"/>
+              </w:rPr>
+            </w:pPr>
+          </w:p>
+        </w:tc>
+        <w:tc>
+          <w:tcPr>
+            <w:tcW w:w="4963" w:type="dxa"/>
+          </w:tcPr>
+          <w:p>
+            <w:pPr>
+              <w:pStyle w:val="template"/>
+              <w:jc w:val="both"/>
+              <w:rPr>
+                <w:rFonts w:ascii="Times New Roman" w:hAnsi="Times New Roman"/>
+                <w:i w:val="0"/>
+                <w:iCs/>
+                <w:sz w:val="24"/>
+                <w:szCs w:val="24"/>
+              </w:rPr>
+            </w:pPr>
+            <w:r>
+              <w:rPr>
+                <w:rFonts w:ascii="Times New Roman" w:hAnsi="Times New Roman"/>
+                <w:i w:val="0"/>
+                <w:iCs/>
+                <w:sz w:val="24"/>
+                <w:szCs w:val="24"/>
+              </w:rPr>
+              <w:t>Creates booking requests with start/end dates, pet profiles, and notes.</w:t>
+            </w:r>
+          </w:p>
+        </w:tc>
+      </w:tr>
+      <w:tr>
+        <w:trPr>
+          <w:trHeight w:val="593"/>
+        </w:trPr>
+        <w:tc>
+          <w:tcPr>
+            <w:tcW w:w="4963" w:type="dxa"/>
+          </w:tcPr>
+          <w:p>
+            <w:pPr>
+              <w:pStyle w:val="template"/>
+              <w:tabs>
+                <w:tab w:val="left" w:pos="3600"/>
+              </w:tabs>
+              <w:rPr>
+                <w:rFonts w:ascii="Times New Roman" w:hAnsi="Times New Roman"/>
+                <w:i w:val="0"/>
+                <w:iCs/>
+                <w:sz w:val="24"/>
+                <w:szCs w:val="24"/>
+              </w:rPr>
+            </w:pPr>
+            <w:r>
+              <w:rPr>
+                <w:rFonts w:ascii="Times New Roman" w:hAnsi="Times New Roman"/>
+                <w:i w:val="0"/>
+                <w:iCs/>
+                <w:sz w:val="24"/>
+                <w:szCs w:val="24"/>
+              </w:rPr>
+              <w:t>Provider Panel</w:t>
+            </w:r>
+          </w:p>
+        </w:tc>
+        <w:tc>
+          <w:tcPr>
+            <w:tcW w:w="4963" w:type="dxa"/>
+          </w:tcPr>
+          <w:p>
+            <w:pPr>
+              <w:pStyle w:val="template"/>
+              <w:jc w:val="both"/>
+              <w:rPr>
+                <w:rFonts w:ascii="Times New Roman" w:hAnsi="Times New Roman"/>
+                <w:i w:val="0"/>
+                <w:iCs/>
+                <w:sz w:val="24"/>
+                <w:szCs w:val="24"/>
+              </w:rPr>
+            </w:pPr>
+            <w:r>
+              <w:rPr>
+                <w:rFonts w:ascii="Times New Roman" w:hAnsi="Times New Roman"/>
+                <w:i w:val="0"/>
+                <w:iCs/>
+                <w:sz w:val="24"/>
+                <w:szCs w:val="24"/>
+              </w:rPr>
+              <w:t>Shows pending, active, and completed booking requests to providers</w:t>
+            </w:r>
+            <w:r>
+              <w:rPr>
+                <w:rFonts w:ascii="Times New Roman" w:hAnsi="Times New Roman"/>
+                <w:i w:val="0"/>
+                <w:iCs/>
+                <w:sz w:val="24"/>
+                <w:szCs w:val="24"/>
+              </w:rPr>
+              <w:t xml:space="preserve"> </w:t>
+            </w:r>
+          </w:p>
+        </w:tc>
+      </w:tr>
+      <w:tr>
+        <w:tc>
+          <w:tcPr>
+            <w:tcW w:w="4963" w:type="dxa"/>
+          </w:tcPr>
+          <w:p>
+            <w:pPr>
+              <w:pStyle w:val="template"/>
+              <w:tabs>
+                <w:tab w:val="left" w:pos="3600"/>
+              </w:tabs>
+              <w:jc w:val="both"/>
+              <w:rPr>
+                <w:rFonts w:ascii="Times New Roman" w:hAnsi="Times New Roman"/>
+                <w:i w:val="0"/>
+                <w:iCs/>
+                <w:sz w:val="24"/>
+                <w:szCs w:val="24"/>
+              </w:rPr>
+            </w:pPr>
+            <w:r>
+              <w:rPr>
+                <w:rFonts w:ascii="Times New Roman" w:hAnsi="Times New Roman"/>
+                <w:i w:val="0"/>
+                <w:iCs/>
+                <w:sz w:val="24"/>
+                <w:szCs w:val="24"/>
+              </w:rPr>
+              <w:t>Status Manager</w:t>
+            </w:r>
+          </w:p>
+        </w:tc>
+        <w:tc>
+          <w:tcPr>
+            <w:tcW w:w="4963" w:type="dxa"/>
+          </w:tcPr>
+          <w:p>
+            <w:pPr>
+              <w:pStyle w:val="template"/>
+              <w:jc w:val="both"/>
+              <w:rPr>
+                <w:rFonts w:ascii="Times New Roman" w:hAnsi="Times New Roman"/>
+                <w:i w:val="0"/>
+                <w:iCs/>
+                <w:sz w:val="24"/>
+                <w:szCs w:val="24"/>
+              </w:rPr>
+            </w:pPr>
+            <w:proofErr w:type="spellStart"/>
+            <w:r>
+              <w:rPr>
+                <w:rFonts w:ascii="Times New Roman" w:hAnsi="Times New Roman"/>
+                <w:i w:val="0"/>
+                <w:iCs/>
+                <w:sz w:val="24"/>
+                <w:szCs w:val="24"/>
+              </w:rPr>
+              <w:t>Lets</w:t>
+            </w:r>
+            <w:proofErr w:type="spellEnd"/>
+            <w:r>
+              <w:rPr>
+                <w:rFonts w:ascii="Times New Roman" w:hAnsi="Times New Roman"/>
+                <w:i w:val="0"/>
+                <w:iCs/>
+                <w:sz w:val="24"/>
+                <w:szCs w:val="24"/>
+              </w:rPr>
+              <w:t xml:space="preserve"> providers accept or reject bookings, which updates database state.</w:t>
+            </w:r>
+          </w:p>
+        </w:tc>
+      </w:tr>
+    </w:tbl>
+    <w:p/>
+    <w:p/>
+    <w:p>
+      <w:pPr>
+        <w:pStyle w:val="Heading3"/>
+      </w:pPr>
+      <w:r>
+        <w:t>E-Commerce Modules</w:t>
+      </w:r>
+    </w:p>
+    <w:p>
+      <w:pPr>
+        <w:rPr>
+          <w:rFonts w:ascii="Times New Roman" w:hAnsi="Times New Roman"/>
+          <w:b/>
+          <w:bCs/>
+        </w:rPr>
+      </w:pPr>
+      <w:r>
+        <w:rPr>
+          <w:rFonts w:ascii="Times New Roman" w:hAnsi="Times New Roman"/>
+          <w:b/>
+          <w:bCs/>
+        </w:rPr>
+        <w:t>Purpose:</w:t>
+      </w:r>
+    </w:p>
+    <w:p/>
+    <w:p>
+      <w:r>
+        <w:t>Handles Store Operations, Cart Updates and Inventory tracking</w:t>
+      </w:r>
+    </w:p>
+    <w:p/>
+    <w:p>
+      <w:pPr>
+        <w:pStyle w:val="template"/>
+        <w:jc w:val="both"/>
+        <w:rPr>
+          <w:rFonts w:ascii="Times New Roman" w:hAnsi="Times New Roman"/>
+          <w:b/>
+          <w:bCs/>
+          <w:i w:val="0"/>
+          <w:sz w:val="24"/>
+        </w:rPr>
+      </w:pPr>
+      <w:r>
+        <w:rPr>
+          <w:rFonts w:ascii="Times New Roman" w:hAnsi="Times New Roman"/>
+          <w:b/>
+          <w:bCs/>
+          <w:i w:val="0"/>
+          <w:sz w:val="24"/>
+        </w:rPr>
+        <w:t>Sub-Modules &amp; Descriptions</w:t>
+      </w:r>
+    </w:p>
+    <w:p>
+      <w:pPr>
+        <w:pStyle w:val="template"/>
+        <w:jc w:val="both"/>
+        <w:rPr>
+          <w:rFonts w:ascii="Times" w:hAnsi="Times"/>
+          <w:i w:val="0"/>
+          <w:sz w:val="24"/>
+        </w:rPr>
+      </w:pPr>
+    </w:p>
+    <w:tbl>
+      <w:tblPr>
+        <w:tblStyle w:val="TableGrid"/>
+        <w:tblW w:w="0" w:type="auto"/>
+        <w:tblLook w:val="04A0" w:firstRow="1" w:lastRow="0" w:firstColumn="1" w:lastColumn="0" w:noHBand="0" w:noVBand="1"/>
+      </w:tblPr>
+      <w:tblGrid>
+        <w:gridCol w:w="4963"/>
+        <w:gridCol w:w="4963"/>
+      </w:tblGrid>
+      <w:tr>
+        <w:trPr>
+          <w:trHeight w:val="323"/>
+        </w:trPr>
+        <w:tc>
+          <w:tcPr>
+            <w:tcW w:w="4963" w:type="dxa"/>
+          </w:tcPr>
+          <w:p>
+            <w:pPr>
+              <w:pStyle w:val="template"/>
+              <w:tabs>
+                <w:tab w:val="left" w:pos="3090"/>
+              </w:tabs>
+              <w:jc w:val="both"/>
+              <w:rPr>
+                <w:rFonts w:asciiTheme="majorBidi" w:hAnsiTheme="majorBidi" w:cstheme="majorBidi"/>
+                <w:b/>
+                <w:bCs/>
+                <w:i w:val="0"/>
+                <w:iCs/>
+                <w:sz w:val="24"/>
+                <w:szCs w:val="24"/>
+              </w:rPr>
+            </w:pPr>
+            <w:r>
+              <w:rPr>
+                <w:rFonts w:asciiTheme="majorBidi" w:hAnsiTheme="majorBidi" w:cstheme="majorBidi"/>
+                <w:b/>
+                <w:bCs/>
+                <w:i w:val="0"/>
+                <w:iCs/>
+                <w:sz w:val="24"/>
+                <w:szCs w:val="24"/>
+              </w:rPr>
+              <w:tab/>
+              <w:t>Sub-Module</w:t>
+            </w:r>
+          </w:p>
+        </w:tc>
+        <w:tc>
+          <w:tcPr>
+            <w:tcW w:w="4963" w:type="dxa"/>
+          </w:tcPr>
+          <w:p>
+            <w:pPr>
+              <w:pStyle w:val="template"/>
+              <w:jc w:val="center"/>
+              <w:rPr>
+                <w:rFonts w:asciiTheme="majorBidi" w:hAnsiTheme="majorBidi" w:cstheme="majorBidi"/>
+                <w:b/>
+                <w:bCs/>
+                <w:i w:val="0"/>
+                <w:iCs/>
+                <w:sz w:val="24"/>
+                <w:szCs w:val="24"/>
+              </w:rPr>
+            </w:pPr>
+            <w:r>
+              <w:rPr>
+                <w:rFonts w:asciiTheme="majorBidi" w:hAnsiTheme="majorBidi" w:cstheme="majorBidi"/>
+                <w:b/>
+                <w:bCs/>
+                <w:i w:val="0"/>
+                <w:iCs/>
+                <w:sz w:val="24"/>
+                <w:szCs w:val="24"/>
+              </w:rPr>
+              <w:t>Functional Description</w:t>
+            </w:r>
+          </w:p>
+        </w:tc>
+      </w:tr>
+      <w:tr>
+        <w:tc>
+          <w:tcPr>
+            <w:tcW w:w="4963" w:type="dxa"/>
+          </w:tcPr>
+          <w:p>
+            <w:pPr>
+              <w:pStyle w:val="template"/>
+              <w:tabs>
+                <w:tab w:val="left" w:pos="2865"/>
+              </w:tabs>
+              <w:rPr>
+                <w:rFonts w:ascii="Times New Roman" w:hAnsi="Times New Roman"/>
+                <w:i w:val="0"/>
+                <w:sz w:val="24"/>
+                <w:szCs w:val="24"/>
+              </w:rPr>
+            </w:pPr>
+            <w:r>
+              <w:rPr>
+                <w:rFonts w:ascii="Times New Roman" w:hAnsi="Times New Roman"/>
+                <w:i w:val="0"/>
+                <w:sz w:val="24"/>
+                <w:szCs w:val="24"/>
+              </w:rPr>
+              <w:t xml:space="preserve">Storefront Catalog </w:t>
+            </w:r>
+          </w:p>
+        </w:tc>
+        <w:tc>
+          <w:tcPr>
+            <w:tcW w:w="4963" w:type="dxa"/>
+          </w:tcPr>
+          <w:p>
+            <w:pPr>
+              <w:pStyle w:val="template"/>
+              <w:jc w:val="both"/>
+              <w:rPr>
+                <w:rFonts w:ascii="Times New Roman" w:hAnsi="Times New Roman"/>
+                <w:i w:val="0"/>
+                <w:sz w:val="24"/>
+                <w:szCs w:val="24"/>
+              </w:rPr>
+            </w:pPr>
+            <w:r>
+              <w:rPr>
+                <w:rFonts w:ascii="Times New Roman" w:hAnsi="Times New Roman"/>
+                <w:i w:val="0"/>
+                <w:sz w:val="24"/>
+                <w:szCs w:val="24"/>
+              </w:rPr>
+              <w:t>Shows product categories, names, prices, and images.</w:t>
+            </w:r>
+          </w:p>
+        </w:tc>
+      </w:tr>
+      <w:tr>
+        <w:trPr>
+          <w:trHeight w:val="593"/>
+        </w:trPr>
+        <w:tc>
+          <w:tcPr>
+            <w:tcW w:w="4963" w:type="dxa"/>
+          </w:tcPr>
+          <w:p>
+            <w:pPr>
+              <w:pStyle w:val="template"/>
+              <w:tabs>
+                <w:tab w:val="left" w:pos="3600"/>
+              </w:tabs>
+              <w:rPr>
+                <w:rFonts w:ascii="Times New Roman" w:hAnsi="Times New Roman"/>
+                <w:i w:val="0"/>
+                <w:sz w:val="24"/>
+                <w:szCs w:val="24"/>
+              </w:rPr>
+            </w:pPr>
+            <w:r>
+              <w:rPr>
+                <w:rFonts w:ascii="Times New Roman" w:hAnsi="Times New Roman"/>
+                <w:i w:val="0"/>
+                <w:sz w:val="24"/>
+                <w:szCs w:val="24"/>
+              </w:rPr>
+              <w:t>Cart Manager</w:t>
+            </w:r>
+          </w:p>
+        </w:tc>
+        <w:tc>
+          <w:tcPr>
+            <w:tcW w:w="4963" w:type="dxa"/>
+          </w:tcPr>
+          <w:p>
+            <w:pPr>
+              <w:pStyle w:val="template"/>
+              <w:jc w:val="both"/>
+              <w:rPr>
+                <w:rFonts w:ascii="Times New Roman" w:hAnsi="Times New Roman"/>
+                <w:i w:val="0"/>
+                <w:sz w:val="24"/>
+                <w:szCs w:val="24"/>
+              </w:rPr>
+            </w:pPr>
+            <w:r>
+              <w:rPr>
+                <w:rFonts w:ascii="Times New Roman" w:hAnsi="Times New Roman"/>
+                <w:i w:val="0"/>
+                <w:sz w:val="24"/>
+                <w:szCs w:val="24"/>
+              </w:rPr>
+              <w:t>Handles additions, removals, and quantity changes in the cart.</w:t>
+            </w:r>
+          </w:p>
+        </w:tc>
+      </w:tr>
+      <w:tr>
+        <w:tc>
+          <w:tcPr>
+            <w:tcW w:w="4963" w:type="dxa"/>
+          </w:tcPr>
+          <w:p>
+            <w:pPr>
+              <w:pStyle w:val="template"/>
+              <w:tabs>
+                <w:tab w:val="left" w:pos="3600"/>
+              </w:tabs>
+              <w:jc w:val="both"/>
+              <w:rPr>
+                <w:rFonts w:ascii="Times New Roman" w:hAnsi="Times New Roman"/>
+                <w:i w:val="0"/>
+                <w:sz w:val="24"/>
+                <w:szCs w:val="24"/>
+              </w:rPr>
+            </w:pPr>
+            <w:r>
+              <w:rPr>
+                <w:rFonts w:ascii="Times New Roman" w:hAnsi="Times New Roman"/>
+                <w:i w:val="0"/>
+                <w:sz w:val="24"/>
+                <w:szCs w:val="24"/>
+              </w:rPr>
+              <w:t>Inventory Manager</w:t>
+            </w:r>
+          </w:p>
+        </w:tc>
+        <w:tc>
+          <w:tcPr>
+            <w:tcW w:w="4963" w:type="dxa"/>
+          </w:tcPr>
+          <w:p>
+            <w:pPr>
+              <w:pStyle w:val="template"/>
+              <w:jc w:val="both"/>
+              <w:rPr>
+                <w:rFonts w:ascii="Times New Roman" w:hAnsi="Times New Roman"/>
+                <w:i w:val="0"/>
+                <w:sz w:val="24"/>
+                <w:szCs w:val="24"/>
+              </w:rPr>
+            </w:pPr>
+            <w:r>
+              <w:rPr>
+                <w:rFonts w:ascii="Times New Roman" w:hAnsi="Times New Roman"/>
+                <w:i w:val="0"/>
+                <w:sz w:val="24"/>
+                <w:szCs w:val="24"/>
+              </w:rPr>
+              <w:t>Tracks product stock levels and updates availability flags.</w:t>
+            </w:r>
+          </w:p>
+        </w:tc>
+      </w:tr>
+    </w:tbl>
+    <w:p>
+      <w:pPr>
+        <w:pStyle w:val="Heading3"/>
+      </w:pPr>
+      <w:r>
+        <w:lastRenderedPageBreak/>
+        <w:t>Payment Processing Module</w:t>
+      </w:r>
+    </w:p>
+    <w:p>
+      <w:pPr>
+        <w:rPr>
+          <w:b/>
+          <w:bCs/>
+        </w:rPr>
+      </w:pPr>
+      <w:r>
+        <w:rPr>
+          <w:b/>
+          <w:bCs/>
+        </w:rPr>
+        <w:t>Purpose:</w:t>
+      </w:r>
+    </w:p>
+    <w:p/>
+    <w:p>
+      <w:r>
+        <w:t>Manages checkout transactions and stripe integrations</w:t>
+      </w:r>
+    </w:p>
+    <w:p/>
+    <w:p>
+      <w:pPr>
+        <w:pStyle w:val="template"/>
+        <w:jc w:val="both"/>
+        <w:rPr>
+          <w:rFonts w:ascii="Times New Roman" w:hAnsi="Times New Roman"/>
+          <w:b/>
+          <w:bCs/>
+          <w:i w:val="0"/>
+          <w:sz w:val="24"/>
+        </w:rPr>
+      </w:pPr>
+      <w:r>
+        <w:rPr>
+          <w:rFonts w:ascii="Times New Roman" w:hAnsi="Times New Roman"/>
+          <w:b/>
+          <w:bCs/>
+          <w:i w:val="0"/>
+          <w:sz w:val="24"/>
+        </w:rPr>
+        <w:t>Sub-Modules &amp; Descriptions</w:t>
+      </w:r>
+    </w:p>
+    <w:p>
+      <w:pPr>
+        <w:pStyle w:val="template"/>
+        <w:jc w:val="both"/>
+        <w:rPr>
+          <w:rFonts w:ascii="Times" w:hAnsi="Times"/>
+          <w:i w:val="0"/>
+          <w:sz w:val="24"/>
+        </w:rPr>
+      </w:pPr>
+    </w:p>
+    <w:tbl>
+      <w:tblPr>
+        <w:tblStyle w:val="TableGrid"/>
+        <w:tblW w:w="0" w:type="auto"/>
+        <w:tblLook w:val="04A0" w:firstRow="1" w:lastRow="0" w:firstColumn="1" w:lastColumn="0" w:noHBand="0" w:noVBand="1"/>
+      </w:tblPr>
+      <w:tblGrid>
+        <w:gridCol w:w="4963"/>
+        <w:gridCol w:w="4963"/>
+      </w:tblGrid>
+      <w:tr>
+        <w:trPr>
+          <w:trHeight w:val="323"/>
+        </w:trPr>
+        <w:tc>
+          <w:tcPr>
+            <w:tcW w:w="4963" w:type="dxa"/>
+          </w:tcPr>
+          <w:p>
+            <w:pPr>
+              <w:pStyle w:val="template"/>
+              <w:tabs>
+                <w:tab w:val="left" w:pos="3090"/>
+              </w:tabs>
+              <w:jc w:val="both"/>
+              <w:rPr>
+                <w:rFonts w:asciiTheme="majorBidi" w:hAnsiTheme="majorBidi" w:cstheme="majorBidi"/>
+                <w:b/>
+                <w:bCs/>
+                <w:i w:val="0"/>
+                <w:iCs/>
+                <w:sz w:val="24"/>
+                <w:szCs w:val="24"/>
+              </w:rPr>
+            </w:pPr>
+            <w:r>
+              <w:rPr>
+                <w:rFonts w:asciiTheme="majorBidi" w:hAnsiTheme="majorBidi" w:cstheme="majorBidi"/>
+                <w:b/>
+                <w:bCs/>
+                <w:i w:val="0"/>
+                <w:iCs/>
+                <w:sz w:val="24"/>
+                <w:szCs w:val="24"/>
+              </w:rPr>
+              <w:tab/>
+              <w:t>Sub-Module</w:t>
+            </w:r>
+          </w:p>
+        </w:tc>
+        <w:tc>
+          <w:tcPr>
+            <w:tcW w:w="4963" w:type="dxa"/>
+          </w:tcPr>
+          <w:p>
+            <w:pPr>
+              <w:pStyle w:val="template"/>
+              <w:jc w:val="center"/>
+              <w:rPr>
+                <w:rFonts w:asciiTheme="majorBidi" w:hAnsiTheme="majorBidi" w:cstheme="majorBidi"/>
+                <w:b/>
+                <w:bCs/>
+                <w:i w:val="0"/>
+                <w:iCs/>
+                <w:sz w:val="24"/>
+                <w:szCs w:val="24"/>
+              </w:rPr>
+            </w:pPr>
+            <w:r>
+              <w:rPr>
+                <w:rFonts w:asciiTheme="majorBidi" w:hAnsiTheme="majorBidi" w:cstheme="majorBidi"/>
+                <w:b/>
+                <w:bCs/>
+                <w:i w:val="0"/>
+                <w:iCs/>
+                <w:sz w:val="24"/>
+                <w:szCs w:val="24"/>
+              </w:rPr>
+              <w:t>Functional Description</w:t>
+            </w:r>
+          </w:p>
+        </w:tc>
+      </w:tr>
+      <w:tr>
+        <w:tc>
+          <w:tcPr>
+            <w:tcW w:w="4963" w:type="dxa"/>
+          </w:tcPr>
+          <w:p>
+            <w:pPr>
+              <w:pStyle w:val="template"/>
+              <w:tabs>
+                <w:tab w:val="left" w:pos="2865"/>
+              </w:tabs>
+              <w:rPr>
+                <w:rFonts w:ascii="Times New Roman" w:hAnsi="Times New Roman"/>
+                <w:i w:val="0"/>
+                <w:iCs/>
+                <w:sz w:val="24"/>
+                <w:szCs w:val="24"/>
+              </w:rPr>
+            </w:pPr>
+            <w:r>
+              <w:rPr>
+                <w:rFonts w:ascii="Times New Roman" w:hAnsi="Times New Roman"/>
+                <w:i w:val="0"/>
+                <w:iCs/>
+                <w:sz w:val="24"/>
+                <w:szCs w:val="24"/>
+              </w:rPr>
+              <w:t>Price Calculator</w:t>
+            </w:r>
+          </w:p>
+          <w:p>
+            <w:pPr>
+              <w:pStyle w:val="template"/>
+              <w:tabs>
+                <w:tab w:val="left" w:pos="2865"/>
+              </w:tabs>
+              <w:rPr>
+                <w:rFonts w:ascii="Times New Roman" w:hAnsi="Times New Roman"/>
+                <w:i w:val="0"/>
+                <w:iCs/>
+                <w:sz w:val="24"/>
+                <w:szCs w:val="24"/>
+              </w:rPr>
+            </w:pPr>
+          </w:p>
+        </w:tc>
+        <w:tc>
+          <w:tcPr>
+            <w:tcW w:w="4963" w:type="dxa"/>
+          </w:tcPr>
+          <w:p>
+            <w:pPr>
+              <w:pStyle w:val="template"/>
+              <w:jc w:val="both"/>
+              <w:rPr>
+                <w:rFonts w:ascii="Times New Roman" w:hAnsi="Times New Roman"/>
+                <w:i w:val="0"/>
+                <w:iCs/>
+                <w:sz w:val="24"/>
+                <w:szCs w:val="24"/>
+              </w:rPr>
+            </w:pPr>
+            <w:r>
+              <w:rPr>
+                <w:rFonts w:ascii="Times New Roman" w:hAnsi="Times New Roman"/>
+                <w:i w:val="0"/>
+                <w:iCs/>
+                <w:sz w:val="24"/>
+                <w:szCs w:val="24"/>
+              </w:rPr>
+              <w:t>Computes the total cost (items + delivery) server-side.</w:t>
+            </w:r>
+          </w:p>
+        </w:tc>
+      </w:tr>
+      <w:tr>
+        <w:trPr>
+          <w:trHeight w:val="593"/>
+        </w:trPr>
+        <w:tc>
+          <w:tcPr>
+            <w:tcW w:w="4963" w:type="dxa"/>
+          </w:tcPr>
+          <w:p>
+            <w:pPr>
+              <w:pStyle w:val="template"/>
+              <w:tabs>
+                <w:tab w:val="left" w:pos="3600"/>
+              </w:tabs>
+              <w:rPr>
+                <w:rFonts w:ascii="Times New Roman" w:hAnsi="Times New Roman"/>
+                <w:i w:val="0"/>
+                <w:iCs/>
+                <w:sz w:val="24"/>
+                <w:szCs w:val="24"/>
+              </w:rPr>
+            </w:pPr>
+            <w:r>
+              <w:rPr>
+                <w:rFonts w:ascii="Times New Roman" w:hAnsi="Times New Roman"/>
+                <w:i w:val="0"/>
+                <w:iCs/>
+                <w:sz w:val="24"/>
+                <w:szCs w:val="24"/>
+              </w:rPr>
+              <w:t>Stripe Intent Handler</w:t>
+            </w:r>
+          </w:p>
+        </w:tc>
+        <w:tc>
+          <w:tcPr>
+            <w:tcW w:w="4963" w:type="dxa"/>
+          </w:tcPr>
+          <w:p>
+            <w:pPr>
+              <w:pStyle w:val="template"/>
+              <w:jc w:val="both"/>
+              <w:rPr>
+                <w:rFonts w:ascii="Times New Roman" w:hAnsi="Times New Roman"/>
+                <w:i w:val="0"/>
+                <w:iCs/>
+                <w:sz w:val="24"/>
+                <w:szCs w:val="24"/>
+              </w:rPr>
+            </w:pPr>
+            <w:r>
+              <w:rPr>
+                <w:rFonts w:ascii="Times New Roman" w:hAnsi="Times New Roman"/>
+                <w:i w:val="0"/>
+                <w:iCs/>
+                <w:sz w:val="24"/>
+                <w:szCs w:val="24"/>
+              </w:rPr>
+              <w:t>Requests payment intents from Stripe and returns client secrets to the client.</w:t>
+            </w:r>
+          </w:p>
+        </w:tc>
+      </w:tr>
+      <w:tr>
+        <w:tc>
+          <w:tcPr>
+            <w:tcW w:w="4963" w:type="dxa"/>
+          </w:tcPr>
+          <w:p>
+            <w:pPr>
+              <w:pStyle w:val="template"/>
+              <w:tabs>
+                <w:tab w:val="left" w:pos="3600"/>
+              </w:tabs>
+              <w:jc w:val="both"/>
+              <w:rPr>
+                <w:rFonts w:ascii="Times New Roman" w:hAnsi="Times New Roman"/>
+                <w:i w:val="0"/>
+                <w:iCs/>
+                <w:sz w:val="24"/>
+                <w:szCs w:val="24"/>
+              </w:rPr>
+            </w:pPr>
+            <w:r>
+              <w:rPr>
+                <w:rFonts w:ascii="Times New Roman" w:hAnsi="Times New Roman"/>
+                <w:i w:val="0"/>
+                <w:iCs/>
+                <w:sz w:val="24"/>
+                <w:szCs w:val="24"/>
+              </w:rPr>
+              <w:t>Webhook Monitor</w:t>
+            </w:r>
+          </w:p>
+        </w:tc>
+        <w:tc>
+          <w:tcPr>
+            <w:tcW w:w="4963" w:type="dxa"/>
+          </w:tcPr>
+          <w:p>
+            <w:pPr>
+              <w:pStyle w:val="template"/>
+              <w:jc w:val="both"/>
+              <w:rPr>
+                <w:rFonts w:ascii="Times New Roman" w:hAnsi="Times New Roman"/>
+                <w:i w:val="0"/>
+                <w:iCs/>
+                <w:sz w:val="24"/>
+                <w:szCs w:val="24"/>
+              </w:rPr>
+            </w:pPr>
+            <w:r>
+              <w:rPr>
+                <w:rFonts w:ascii="Times New Roman" w:hAnsi="Times New Roman"/>
+                <w:i w:val="0"/>
+                <w:iCs/>
+                <w:sz w:val="24"/>
+                <w:szCs w:val="24"/>
+              </w:rPr>
+              <w:t>Listens for Stripe payment success notifications to update order records.</w:t>
+            </w:r>
+          </w:p>
+        </w:tc>
+      </w:tr>
+    </w:tbl>
+    <w:p/>
+    <w:p>
+      <w:pPr>
+        <w:pStyle w:val="Heading3"/>
+      </w:pPr>
+      <w:r>
+        <w:t>Health Vault and Scheduler</w:t>
+      </w:r>
+    </w:p>
+    <w:p>
+      <w:pPr>
+        <w:rPr>
+          <w:b/>
+          <w:bCs/>
+        </w:rPr>
+      </w:pPr>
+      <w:r>
+        <w:rPr>
+          <w:b/>
+          <w:bCs/>
+        </w:rPr>
+        <w:t>Purpose:</w:t>
+      </w:r>
+    </w:p>
+    <w:p/>
+    <w:p>
+      <w:r>
+        <w:t>Manages pet health histories and schedules vaccination reminders.</w:t>
+      </w:r>
+    </w:p>
+    <w:p/>
+    <w:p>
+      <w:pPr>
+        <w:pStyle w:val="template"/>
+        <w:jc w:val="both"/>
+        <w:rPr>
+          <w:rFonts w:ascii="Times New Roman" w:hAnsi="Times New Roman"/>
+          <w:b/>
+          <w:bCs/>
+          <w:i w:val="0"/>
+          <w:sz w:val="24"/>
+        </w:rPr>
+      </w:pPr>
+      <w:r>
+        <w:rPr>
+          <w:rFonts w:ascii="Times New Roman" w:hAnsi="Times New Roman"/>
+          <w:b/>
+          <w:bCs/>
+          <w:i w:val="0"/>
+          <w:sz w:val="24"/>
+        </w:rPr>
+        <w:t>Sub-Modules &amp; Descriptions</w:t>
+      </w:r>
+    </w:p>
+    <w:p>
+      <w:pPr>
+        <w:pStyle w:val="template"/>
+        <w:jc w:val="both"/>
+        <w:rPr>
+          <w:rFonts w:ascii="Times" w:hAnsi="Times"/>
+          <w:i w:val="0"/>
+          <w:sz w:val="24"/>
+        </w:rPr>
+      </w:pPr>
+    </w:p>
+    <w:tbl>
+      <w:tblPr>
+        <w:tblStyle w:val="TableGrid"/>
+        <w:tblW w:w="0" w:type="auto"/>
+        <w:tblLook w:val="04A0" w:firstRow="1" w:lastRow="0" w:firstColumn="1" w:lastColumn="0" w:noHBand="0" w:noVBand="1"/>
+      </w:tblPr>
+      <w:tblGrid>
+        <w:gridCol w:w="4963"/>
+        <w:gridCol w:w="4963"/>
+      </w:tblGrid>
+      <w:tr>
+        <w:trPr>
+          <w:trHeight w:val="323"/>
+        </w:trPr>
+        <w:tc>
+          <w:tcPr>
+            <w:tcW w:w="4963" w:type="dxa"/>
+          </w:tcPr>
+          <w:p>
+            <w:pPr>
+              <w:pStyle w:val="template"/>
+              <w:tabs>
+                <w:tab w:val="left" w:pos="3090"/>
+              </w:tabs>
+              <w:jc w:val="both"/>
+              <w:rPr>
+                <w:rFonts w:asciiTheme="majorBidi" w:hAnsiTheme="majorBidi" w:cstheme="majorBidi"/>
+                <w:b/>
+                <w:bCs/>
+                <w:i w:val="0"/>
+                <w:iCs/>
+                <w:sz w:val="24"/>
+                <w:szCs w:val="24"/>
+              </w:rPr>
+            </w:pPr>
+            <w:r>
+              <w:rPr>
+                <w:rFonts w:asciiTheme="majorBidi" w:hAnsiTheme="majorBidi" w:cstheme="majorBidi"/>
+                <w:b/>
+                <w:bCs/>
+                <w:i w:val="0"/>
+                <w:iCs/>
+                <w:sz w:val="24"/>
+                <w:szCs w:val="24"/>
+              </w:rPr>
+              <w:tab/>
+              <w:t>Sub-Module</w:t>
+            </w:r>
+          </w:p>
+        </w:tc>
+        <w:tc>
+          <w:tcPr>
+            <w:tcW w:w="4963" w:type="dxa"/>
+          </w:tcPr>
+          <w:p>
+            <w:pPr>
+              <w:pStyle w:val="template"/>
+              <w:jc w:val="center"/>
+              <w:rPr>
+                <w:rFonts w:asciiTheme="majorBidi" w:hAnsiTheme="majorBidi" w:cstheme="majorBidi"/>
+                <w:b/>
+                <w:bCs/>
+                <w:i w:val="0"/>
+                <w:iCs/>
+                <w:sz w:val="24"/>
+                <w:szCs w:val="24"/>
+              </w:rPr>
+            </w:pPr>
+            <w:r>
+              <w:rPr>
+                <w:rFonts w:asciiTheme="majorBidi" w:hAnsiTheme="majorBidi" w:cstheme="majorBidi"/>
+                <w:b/>
+                <w:bCs/>
+                <w:i w:val="0"/>
+                <w:iCs/>
+                <w:sz w:val="24"/>
+                <w:szCs w:val="24"/>
+              </w:rPr>
+              <w:t>Functional Description</w:t>
+            </w:r>
+          </w:p>
+        </w:tc>
+      </w:tr>
+      <w:tr>
+        <w:tc>
+          <w:tcPr>
+            <w:tcW w:w="4963" w:type="dxa"/>
+          </w:tcPr>
+          <w:p>
+            <w:pPr>
+              <w:pStyle w:val="template"/>
+              <w:tabs>
+                <w:tab w:val="left" w:pos="2865"/>
+              </w:tabs>
+              <w:rPr>
+                <w:rFonts w:ascii="Times New Roman" w:hAnsi="Times New Roman"/>
+                <w:i w:val="0"/>
+                <w:sz w:val="24"/>
+                <w:szCs w:val="24"/>
+              </w:rPr>
+            </w:pPr>
+            <w:r>
+              <w:rPr>
+                <w:rFonts w:ascii="Times New Roman" w:hAnsi="Times New Roman"/>
+                <w:i w:val="0"/>
+                <w:sz w:val="24"/>
+                <w:szCs w:val="24"/>
+              </w:rPr>
+              <w:t>Record logger</w:t>
+            </w:r>
+          </w:p>
+          <w:p>
+            <w:pPr>
+              <w:pStyle w:val="template"/>
+              <w:tabs>
+                <w:tab w:val="left" w:pos="2865"/>
+              </w:tabs>
+              <w:rPr>
+                <w:rFonts w:ascii="Times New Roman" w:hAnsi="Times New Roman"/>
+                <w:i w:val="0"/>
+                <w:sz w:val="24"/>
+                <w:szCs w:val="24"/>
+              </w:rPr>
+            </w:pPr>
+          </w:p>
+        </w:tc>
+        <w:tc>
+          <w:tcPr>
+            <w:tcW w:w="4963" w:type="dxa"/>
+          </w:tcPr>
+          <w:p>
+            <w:pPr>
+              <w:pStyle w:val="template"/>
+              <w:jc w:val="both"/>
+              <w:rPr>
+                <w:rFonts w:ascii="Times New Roman" w:hAnsi="Times New Roman"/>
+                <w:i w:val="0"/>
+                <w:sz w:val="24"/>
+                <w:szCs w:val="24"/>
+              </w:rPr>
+            </w:pPr>
+            <w:r>
+              <w:rPr>
+                <w:rFonts w:ascii="Times New Roman" w:hAnsi="Times New Roman"/>
+                <w:i w:val="0"/>
+                <w:sz w:val="24"/>
+                <w:szCs w:val="24"/>
+              </w:rPr>
+              <w:t>Logs vaccine names, dates, and calculated next due dates.</w:t>
+            </w:r>
+          </w:p>
+        </w:tc>
+      </w:tr>
+      <w:tr>
+        <w:trPr>
+          <w:trHeight w:val="593"/>
+        </w:trPr>
+        <w:tc>
+          <w:tcPr>
+            <w:tcW w:w="4963" w:type="dxa"/>
+          </w:tcPr>
+          <w:p>
+            <w:pPr>
+              <w:pStyle w:val="template"/>
+              <w:tabs>
+                <w:tab w:val="left" w:pos="3600"/>
+              </w:tabs>
+              <w:rPr>
+                <w:rFonts w:ascii="Times New Roman" w:hAnsi="Times New Roman"/>
+                <w:i w:val="0"/>
+                <w:sz w:val="24"/>
+                <w:szCs w:val="24"/>
+              </w:rPr>
+            </w:pPr>
+            <w:r>
+              <w:rPr>
+                <w:rFonts w:ascii="Times New Roman" w:hAnsi="Times New Roman"/>
+                <w:i w:val="0"/>
+                <w:sz w:val="24"/>
+                <w:szCs w:val="24"/>
+              </w:rPr>
+              <w:t xml:space="preserve">Daily </w:t>
+            </w:r>
+            <w:proofErr w:type="spellStart"/>
+            <w:r>
+              <w:rPr>
+                <w:rFonts w:ascii="Times New Roman" w:hAnsi="Times New Roman"/>
+                <w:i w:val="0"/>
+                <w:sz w:val="24"/>
+                <w:szCs w:val="24"/>
+              </w:rPr>
+              <w:t>cron</w:t>
+            </w:r>
+            <w:proofErr w:type="spellEnd"/>
+            <w:r>
+              <w:rPr>
+                <w:rFonts w:ascii="Times New Roman" w:hAnsi="Times New Roman"/>
+                <w:i w:val="0"/>
+                <w:sz w:val="24"/>
+                <w:szCs w:val="24"/>
+              </w:rPr>
+              <w:t xml:space="preserve"> worker</w:t>
+            </w:r>
+          </w:p>
+        </w:tc>
+        <w:tc>
+          <w:tcPr>
+            <w:tcW w:w="4963" w:type="dxa"/>
+          </w:tcPr>
+          <w:p>
+            <w:pPr>
+              <w:pStyle w:val="template"/>
+              <w:jc w:val="both"/>
+              <w:rPr>
+                <w:rFonts w:ascii="Times New Roman" w:hAnsi="Times New Roman"/>
+                <w:i w:val="0"/>
+                <w:sz w:val="24"/>
+                <w:szCs w:val="24"/>
+              </w:rPr>
+            </w:pPr>
+            <w:r>
+              <w:rPr>
+                <w:rFonts w:ascii="Times New Roman" w:hAnsi="Times New Roman"/>
+                <w:i w:val="0"/>
+                <w:sz w:val="24"/>
+                <w:szCs w:val="24"/>
+              </w:rPr>
+              <w:t>Checks database records daily to find upcoming vaccine due dates</w:t>
+            </w:r>
+          </w:p>
+        </w:tc>
+      </w:tr>
+      <w:tr>
+        <w:tc>
+          <w:tcPr>
+            <w:tcW w:w="4963" w:type="dxa"/>
+          </w:tcPr>
+          <w:p>
+            <w:pPr>
+              <w:pStyle w:val="template"/>
+              <w:tabs>
+                <w:tab w:val="left" w:pos="3600"/>
+              </w:tabs>
+              <w:jc w:val="both"/>
+              <w:rPr>
+                <w:rFonts w:ascii="Times New Roman" w:hAnsi="Times New Roman"/>
+                <w:i w:val="0"/>
+                <w:sz w:val="24"/>
+                <w:szCs w:val="24"/>
+              </w:rPr>
+            </w:pPr>
+            <w:r>
+              <w:rPr>
+                <w:rFonts w:ascii="Times New Roman" w:hAnsi="Times New Roman"/>
+                <w:i w:val="0"/>
+                <w:sz w:val="24"/>
+                <w:szCs w:val="24"/>
+              </w:rPr>
+              <w:t>Reminder triggers</w:t>
+            </w:r>
+          </w:p>
+        </w:tc>
+        <w:tc>
+          <w:tcPr>
+            <w:tcW w:w="4963" w:type="dxa"/>
+          </w:tcPr>
+          <w:p>
+            <w:pPr>
+              <w:pStyle w:val="template"/>
+              <w:jc w:val="both"/>
+              <w:rPr>
+                <w:rFonts w:ascii="Times New Roman" w:hAnsi="Times New Roman"/>
+                <w:i w:val="0"/>
+                <w:sz w:val="24"/>
+                <w:szCs w:val="24"/>
+              </w:rPr>
+            </w:pPr>
+            <w:r>
+              <w:rPr>
+                <w:rFonts w:ascii="Times New Roman" w:hAnsi="Times New Roman"/>
+                <w:i w:val="0"/>
+                <w:sz w:val="24"/>
+                <w:szCs w:val="24"/>
+              </w:rPr>
+              <w:t>Sends push notifications and email alerts when vaccine due dates approach</w:t>
+            </w:r>
+          </w:p>
+        </w:tc>
+      </w:tr>
+    </w:tbl>
+    <w:p/>
+    <w:p>
+      <w:pPr>
+        <w:pStyle w:val="Heading3"/>
+      </w:pPr>
+      <w:r>
+        <w:t>AI Chatbot Module</w:t>
+      </w:r>
+    </w:p>
+    <w:p>
+      <w:pPr>
+        <w:rPr>
+          <w:b/>
+          <w:bCs/>
+        </w:rPr>
+      </w:pPr>
+      <w:r>
+        <w:rPr>
+          <w:b/>
+          <w:bCs/>
+        </w:rPr>
+        <w:t>Purpose:</w:t>
+      </w:r>
+    </w:p>
+    <w:p/>
+    <w:p>
+      <w:r>
+        <w:t>Provides natural language response support.</w:t>
+      </w:r>
+    </w:p>
+    <w:p/>
+    <w:p>
+      <w:pPr>
+        <w:pStyle w:val="template"/>
+        <w:jc w:val="both"/>
+        <w:rPr>
+          <w:rFonts w:ascii="Times New Roman" w:hAnsi="Times New Roman"/>
+          <w:b/>
+          <w:bCs/>
+          <w:i w:val="0"/>
+          <w:sz w:val="24"/>
+        </w:rPr>
+      </w:pPr>
+      <w:r>
+        <w:rPr>
+          <w:rFonts w:ascii="Times New Roman" w:hAnsi="Times New Roman"/>
+          <w:b/>
+          <w:bCs/>
+          <w:i w:val="0"/>
+          <w:sz w:val="24"/>
+        </w:rPr>
+        <w:t>Sub-Modules &amp; Descriptions</w:t>
+      </w:r>
+    </w:p>
+    <w:p>
+      <w:pPr>
+        <w:pStyle w:val="template"/>
+        <w:jc w:val="both"/>
+        <w:rPr>
+          <w:rFonts w:ascii="Times" w:hAnsi="Times"/>
+          <w:i w:val="0"/>
+          <w:sz w:val="24"/>
+        </w:rPr>
+      </w:pPr>
+    </w:p>
+    <w:tbl>
+      <w:tblPr>
+        <w:tblStyle w:val="TableGrid"/>
+        <w:tblW w:w="0" w:type="auto"/>
+        <w:tblLook w:val="04A0" w:firstRow="1" w:lastRow="0" w:firstColumn="1" w:lastColumn="0" w:noHBand="0" w:noVBand="1"/>
+      </w:tblPr>
+      <w:tblGrid>
+        <w:gridCol w:w="4963"/>
+        <w:gridCol w:w="4963"/>
+      </w:tblGrid>
+      <w:tr>
+        <w:trPr>
+          <w:trHeight w:val="323"/>
+        </w:trPr>
+        <w:tc>
+          <w:tcPr>
+            <w:tcW w:w="4963" w:type="dxa"/>
+          </w:tcPr>
+          <w:p>
+            <w:pPr>
+              <w:pStyle w:val="template"/>
+              <w:tabs>
+                <w:tab w:val="left" w:pos="3090"/>
+              </w:tabs>
+              <w:jc w:val="both"/>
+              <w:rPr>
+                <w:rFonts w:asciiTheme="majorBidi" w:hAnsiTheme="majorBidi" w:cstheme="majorBidi"/>
+                <w:b/>
+                <w:bCs/>
+                <w:i w:val="0"/>
+                <w:iCs/>
+                <w:sz w:val="24"/>
+                <w:szCs w:val="24"/>
+              </w:rPr>
+            </w:pPr>
+            <w:r>
+              <w:rPr>
+                <w:rFonts w:asciiTheme="majorBidi" w:hAnsiTheme="majorBidi" w:cstheme="majorBidi"/>
+                <w:b/>
+                <w:bCs/>
+                <w:i w:val="0"/>
+                <w:iCs/>
+                <w:sz w:val="24"/>
+                <w:szCs w:val="24"/>
+              </w:rPr>
+              <w:tab/>
+              <w:t>Sub-Module</w:t>
+            </w:r>
+          </w:p>
+        </w:tc>
+        <w:tc>
+          <w:tcPr>
+            <w:tcW w:w="4963" w:type="dxa"/>
+          </w:tcPr>
+          <w:p>
+            <w:pPr>
+              <w:pStyle w:val="template"/>
+              <w:jc w:val="center"/>
+              <w:rPr>
+                <w:rFonts w:asciiTheme="majorBidi" w:hAnsiTheme="majorBidi" w:cstheme="majorBidi"/>
+                <w:b/>
+                <w:bCs/>
+                <w:i w:val="0"/>
+                <w:iCs/>
+                <w:sz w:val="24"/>
+                <w:szCs w:val="24"/>
+              </w:rPr>
+            </w:pPr>
+            <w:r>
+              <w:rPr>
+                <w:rFonts w:asciiTheme="majorBidi" w:hAnsiTheme="majorBidi" w:cstheme="majorBidi"/>
+                <w:b/>
+                <w:bCs/>
+                <w:i w:val="0"/>
+                <w:iCs/>
+                <w:sz w:val="24"/>
+                <w:szCs w:val="24"/>
+              </w:rPr>
+              <w:t>Functional Description</w:t>
+            </w:r>
+          </w:p>
+        </w:tc>
+      </w:tr>
+      <w:tr>
+        <w:trPr>
+          <w:trHeight w:val="458"/>
+        </w:trPr>
+        <w:tc>
+          <w:tcPr>
+            <w:tcW w:w="4963" w:type="dxa"/>
+          </w:tcPr>
+          <w:p>
+            <w:pPr>
+              <w:pStyle w:val="template"/>
+              <w:tabs>
+                <w:tab w:val="left" w:pos="2865"/>
+              </w:tabs>
+              <w:rPr>
+                <w:rFonts w:ascii="Times New Roman" w:hAnsi="Times New Roman"/>
+                <w:i w:val="0"/>
+                <w:iCs/>
+                <w:sz w:val="24"/>
+                <w:szCs w:val="24"/>
+              </w:rPr>
+            </w:pPr>
+            <w:r>
+              <w:rPr>
+                <w:rFonts w:ascii="Times New Roman" w:hAnsi="Times New Roman"/>
+                <w:i w:val="0"/>
+                <w:iCs/>
+                <w:sz w:val="24"/>
+                <w:szCs w:val="24"/>
+              </w:rPr>
+              <w:t>Chat Interface</w:t>
+            </w:r>
+          </w:p>
+        </w:tc>
+        <w:tc>
+          <w:tcPr>
+            <w:tcW w:w="4963" w:type="dxa"/>
+          </w:tcPr>
+          <w:p>
+            <w:pPr>
+              <w:pStyle w:val="template"/>
+              <w:jc w:val="both"/>
+              <w:rPr>
+                <w:rFonts w:ascii="Times New Roman" w:hAnsi="Times New Roman"/>
+                <w:i w:val="0"/>
+                <w:iCs/>
+                <w:sz w:val="24"/>
+                <w:szCs w:val="24"/>
+              </w:rPr>
+            </w:pPr>
+            <w:r>
+              <w:rPr>
+                <w:rFonts w:ascii="Times New Roman" w:hAnsi="Times New Roman"/>
+                <w:i w:val="0"/>
+                <w:iCs/>
+                <w:sz w:val="24"/>
+                <w:szCs w:val="24"/>
+              </w:rPr>
+              <w:t>Renders conversation messages in a</w:t>
+            </w:r>
+            <w:r>
+              <w:rPr>
+                <w:rFonts w:ascii="Times New Roman" w:hAnsi="Times New Roman"/>
+                <w:i w:val="0"/>
+                <w:iCs/>
+                <w:sz w:val="24"/>
+                <w:szCs w:val="24"/>
+              </w:rPr>
+              <w:t xml:space="preserve"> chat interface</w:t>
+            </w:r>
+          </w:p>
+        </w:tc>
+      </w:tr>
+      <w:tr>
+        <w:trPr>
+          <w:trHeight w:val="593"/>
+        </w:trPr>
+        <w:tc>
+          <w:tcPr>
+            <w:tcW w:w="4963" w:type="dxa"/>
+          </w:tcPr>
+          <w:p>
+            <w:pPr>
+              <w:pStyle w:val="template"/>
+              <w:tabs>
+                <w:tab w:val="left" w:pos="3600"/>
+              </w:tabs>
+              <w:rPr>
+                <w:rFonts w:ascii="Times New Roman" w:hAnsi="Times New Roman"/>
+                <w:i w:val="0"/>
+                <w:iCs/>
+                <w:sz w:val="24"/>
+                <w:szCs w:val="24"/>
+              </w:rPr>
+            </w:pPr>
+            <w:r>
+              <w:rPr>
+                <w:rFonts w:ascii="Times New Roman" w:hAnsi="Times New Roman"/>
+                <w:i w:val="0"/>
+                <w:iCs/>
+                <w:sz w:val="24"/>
+                <w:szCs w:val="24"/>
+              </w:rPr>
+              <w:t xml:space="preserve">Session Handler </w:t>
+            </w:r>
+          </w:p>
+        </w:tc>
+        <w:tc>
+          <w:tcPr>
+            <w:tcW w:w="4963" w:type="dxa"/>
+          </w:tcPr>
+          <w:p>
+            <w:pPr>
+              <w:pStyle w:val="template"/>
+              <w:jc w:val="both"/>
+              <w:rPr>
+                <w:rFonts w:ascii="Times New Roman" w:hAnsi="Times New Roman"/>
+                <w:i w:val="0"/>
+                <w:iCs/>
+                <w:sz w:val="24"/>
+                <w:szCs w:val="24"/>
+              </w:rPr>
+            </w:pPr>
+            <w:r>
+              <w:rPr>
+                <w:rFonts w:ascii="Times New Roman" w:hAnsi="Times New Roman"/>
+                <w:i w:val="0"/>
+                <w:iCs/>
+                <w:sz w:val="24"/>
+                <w:szCs w:val="24"/>
+              </w:rPr>
+              <w:t>Restores recent messages to maintain context.</w:t>
+            </w:r>
+          </w:p>
+        </w:tc>
+      </w:tr>
+    </w:tbl>
+    <w:p/>
+    <w:p/>
+    <w:p/>
+    <w:p/>
+    <w:p/>
+    <w:p/>
+    <w:p/>
+    <w:p>
+      <w:pPr>
+        <w:pStyle w:val="Heading3"/>
+      </w:pPr>
+      <w:r>
+        <w:lastRenderedPageBreak/>
+        <w:t>Location Module</w:t>
+      </w:r>
+    </w:p>
+    <w:p>
+      <w:pPr>
+        <w:rPr>
+          <w:rFonts w:ascii="Times New Roman" w:hAnsi="Times New Roman"/>
+          <w:b/>
+          <w:bCs/>
+        </w:rPr>
+      </w:pPr>
+      <w:r>
+        <w:rPr>
+          <w:rFonts w:ascii="Times New Roman" w:hAnsi="Times New Roman"/>
+          <w:b/>
+          <w:bCs/>
+        </w:rPr>
+        <w:t>Purpose:</w:t>
+      </w:r>
+    </w:p>
+    <w:p/>
+    <w:p>
+      <w:r>
+        <w:t>Locates nearby veterinary clinics.</w:t>
+      </w:r>
+    </w:p>
+    <w:p/>
+    <w:p>
+      <w:pPr>
+        <w:pStyle w:val="template"/>
+        <w:jc w:val="both"/>
+        <w:rPr>
+          <w:rFonts w:ascii="Times New Roman" w:hAnsi="Times New Roman"/>
+          <w:b/>
+          <w:bCs/>
+          <w:i w:val="0"/>
+          <w:sz w:val="24"/>
+        </w:rPr>
+      </w:pPr>
+      <w:r>
+        <w:rPr>
+          <w:rFonts w:ascii="Times New Roman" w:hAnsi="Times New Roman"/>
+          <w:b/>
+          <w:bCs/>
+          <w:i w:val="0"/>
+          <w:sz w:val="24"/>
+        </w:rPr>
+        <w:t>Sub-Modules &amp; Descriptions</w:t>
+      </w:r>
+    </w:p>
+    <w:p>
+      <w:pPr>
+        <w:pStyle w:val="template"/>
+        <w:jc w:val="both"/>
+        <w:rPr>
+          <w:rFonts w:ascii="Times" w:hAnsi="Times"/>
+          <w:i w:val="0"/>
+          <w:sz w:val="24"/>
+        </w:rPr>
+      </w:pPr>
+    </w:p>
+    <w:tbl>
+      <w:tblPr>
+        <w:tblStyle w:val="TableGrid"/>
+        <w:tblW w:w="0" w:type="auto"/>
+        <w:tblLook w:val="04A0" w:firstRow="1" w:lastRow="0" w:firstColumn="1" w:lastColumn="0" w:noHBand="0" w:noVBand="1"/>
+      </w:tblPr>
+      <w:tblGrid>
+        <w:gridCol w:w="4963"/>
+        <w:gridCol w:w="4963"/>
+      </w:tblGrid>
+      <w:tr>
+        <w:trPr>
+          <w:trHeight w:val="323"/>
+        </w:trPr>
+        <w:tc>
+          <w:tcPr>
+            <w:tcW w:w="4963" w:type="dxa"/>
+          </w:tcPr>
+          <w:p>
+            <w:pPr>
+              <w:pStyle w:val="template"/>
+              <w:tabs>
+                <w:tab w:val="left" w:pos="3090"/>
+              </w:tabs>
+              <w:jc w:val="both"/>
+              <w:rPr>
+                <w:rFonts w:asciiTheme="majorBidi" w:hAnsiTheme="majorBidi" w:cstheme="majorBidi"/>
+                <w:b/>
+                <w:bCs/>
+                <w:i w:val="0"/>
+                <w:iCs/>
+                <w:sz w:val="24"/>
+                <w:szCs w:val="24"/>
+              </w:rPr>
+            </w:pPr>
+            <w:r>
+              <w:rPr>
+                <w:rFonts w:asciiTheme="majorBidi" w:hAnsiTheme="majorBidi" w:cstheme="majorBidi"/>
+                <w:b/>
+                <w:bCs/>
+                <w:i w:val="0"/>
+                <w:iCs/>
+                <w:sz w:val="24"/>
+                <w:szCs w:val="24"/>
+              </w:rPr>
+              <w:tab/>
+              <w:t>Sub-Module</w:t>
+            </w:r>
+          </w:p>
+        </w:tc>
+        <w:tc>
+          <w:tcPr>
+            <w:tcW w:w="4963" w:type="dxa"/>
+          </w:tcPr>
+          <w:p>
+            <w:pPr>
+              <w:pStyle w:val="template"/>
+              <w:jc w:val="center"/>
+              <w:rPr>
+                <w:rFonts w:asciiTheme="majorBidi" w:hAnsiTheme="majorBidi" w:cstheme="majorBidi"/>
+                <w:b/>
+                <w:bCs/>
+                <w:i w:val="0"/>
+                <w:iCs/>
+                <w:sz w:val="24"/>
+                <w:szCs w:val="24"/>
+              </w:rPr>
+            </w:pPr>
+            <w:r>
+              <w:rPr>
+                <w:rFonts w:asciiTheme="majorBidi" w:hAnsiTheme="majorBidi" w:cstheme="majorBidi"/>
+                <w:b/>
+                <w:bCs/>
+                <w:i w:val="0"/>
+                <w:iCs/>
+                <w:sz w:val="24"/>
+                <w:szCs w:val="24"/>
+              </w:rPr>
+              <w:t>Functional Description</w:t>
+            </w:r>
+          </w:p>
+        </w:tc>
+      </w:tr>
+      <w:tr>
+        <w:trPr>
+          <w:trHeight w:val="440"/>
+        </w:trPr>
+        <w:tc>
+          <w:tcPr>
+            <w:tcW w:w="4963" w:type="dxa"/>
+          </w:tcPr>
+          <w:p>
+            <w:pPr>
+              <w:pStyle w:val="template"/>
+              <w:tabs>
+                <w:tab w:val="left" w:pos="2865"/>
+              </w:tabs>
+              <w:rPr>
+                <w:rFonts w:ascii="Times New Roman" w:hAnsi="Times New Roman"/>
+                <w:i w:val="0"/>
+                <w:iCs/>
+                <w:sz w:val="24"/>
+                <w:szCs w:val="24"/>
+              </w:rPr>
+            </w:pPr>
+            <w:r>
+              <w:rPr>
+                <w:rFonts w:ascii="Times New Roman" w:hAnsi="Times New Roman"/>
+                <w:i w:val="0"/>
+                <w:iCs/>
+                <w:sz w:val="24"/>
+                <w:szCs w:val="24"/>
+              </w:rPr>
+              <w:t xml:space="preserve">GPS Coordinate Tracker </w:t>
+            </w:r>
+          </w:p>
+        </w:tc>
+        <w:tc>
+          <w:tcPr>
+            <w:tcW w:w="4963" w:type="dxa"/>
+          </w:tcPr>
+          <w:p>
+            <w:pPr>
+              <w:pStyle w:val="template"/>
+              <w:jc w:val="both"/>
+              <w:rPr>
+                <w:rFonts w:ascii="Times New Roman" w:hAnsi="Times New Roman"/>
+                <w:i w:val="0"/>
+                <w:iCs/>
+                <w:sz w:val="24"/>
+                <w:szCs w:val="24"/>
+              </w:rPr>
+            </w:pPr>
+            <w:r>
+              <w:rPr>
+                <w:rFonts w:ascii="Times New Roman" w:hAnsi="Times New Roman"/>
+                <w:i w:val="0"/>
+                <w:iCs/>
+                <w:sz w:val="24"/>
+                <w:szCs w:val="24"/>
+              </w:rPr>
+              <w:t>Retrieves current device coordinates</w:t>
+            </w:r>
+          </w:p>
+        </w:tc>
+      </w:tr>
+      <w:tr>
+        <w:trPr>
+          <w:trHeight w:val="593"/>
+        </w:trPr>
+        <w:tc>
+          <w:tcPr>
+            <w:tcW w:w="4963" w:type="dxa"/>
+          </w:tcPr>
+          <w:p>
+            <w:pPr>
+              <w:pStyle w:val="template"/>
+              <w:tabs>
+                <w:tab w:val="left" w:pos="3600"/>
+              </w:tabs>
+              <w:rPr>
+                <w:rFonts w:ascii="Times New Roman" w:hAnsi="Times New Roman"/>
+                <w:i w:val="0"/>
+                <w:iCs/>
+                <w:sz w:val="24"/>
+                <w:szCs w:val="24"/>
+              </w:rPr>
+            </w:pPr>
+            <w:r>
+              <w:rPr>
+                <w:rFonts w:ascii="Times New Roman" w:hAnsi="Times New Roman"/>
+                <w:i w:val="0"/>
+                <w:iCs/>
+                <w:sz w:val="24"/>
+                <w:szCs w:val="24"/>
+              </w:rPr>
+              <w:t>API Proxy</w:t>
+            </w:r>
+          </w:p>
+        </w:tc>
+        <w:tc>
+          <w:tcPr>
+            <w:tcW w:w="4963" w:type="dxa"/>
+          </w:tcPr>
+          <w:p>
+            <w:pPr>
+              <w:pStyle w:val="template"/>
+              <w:jc w:val="both"/>
+              <w:rPr>
+                <w:rFonts w:ascii="Times New Roman" w:hAnsi="Times New Roman"/>
+                <w:i w:val="0"/>
+                <w:iCs/>
+                <w:sz w:val="24"/>
+                <w:szCs w:val="24"/>
+              </w:rPr>
+            </w:pPr>
+            <w:r>
+              <w:rPr>
+                <w:rFonts w:ascii="Times New Roman" w:hAnsi="Times New Roman"/>
+                <w:i w:val="0"/>
+                <w:iCs/>
+                <w:sz w:val="24"/>
+                <w:szCs w:val="24"/>
+              </w:rPr>
+              <w:t>Safe backend proxy that queries Google Places API using secret keys</w:t>
+            </w:r>
+          </w:p>
+        </w:tc>
+      </w:tr>
+      <w:tr>
+        <w:trPr>
+          <w:trHeight w:val="386"/>
+        </w:trPr>
+        <w:tc>
+          <w:tcPr>
+            <w:tcW w:w="4963" w:type="dxa"/>
+          </w:tcPr>
+          <w:p>
+            <w:pPr>
+              <w:pStyle w:val="template"/>
+              <w:tabs>
+                <w:tab w:val="left" w:pos="3600"/>
+              </w:tabs>
+              <w:jc w:val="both"/>
+              <w:rPr>
+                <w:rFonts w:ascii="Times New Roman" w:hAnsi="Times New Roman"/>
+                <w:i w:val="0"/>
+                <w:iCs/>
+                <w:sz w:val="24"/>
+                <w:szCs w:val="24"/>
+              </w:rPr>
+            </w:pPr>
+            <w:r>
+              <w:rPr>
+                <w:rFonts w:ascii="Times New Roman" w:hAnsi="Times New Roman"/>
+                <w:i w:val="0"/>
+                <w:iCs/>
+                <w:sz w:val="24"/>
+                <w:szCs w:val="24"/>
+              </w:rPr>
+              <w:t>Map Pin Renderer</w:t>
+            </w:r>
+          </w:p>
+        </w:tc>
+        <w:tc>
+          <w:tcPr>
+            <w:tcW w:w="4963" w:type="dxa"/>
+          </w:tcPr>
+          <w:p>
+            <w:pPr>
+              <w:pStyle w:val="template"/>
+              <w:jc w:val="both"/>
+              <w:rPr>
+                <w:rFonts w:ascii="Times New Roman" w:hAnsi="Times New Roman"/>
+                <w:i w:val="0"/>
+                <w:iCs/>
+                <w:sz w:val="24"/>
+                <w:szCs w:val="24"/>
+              </w:rPr>
+            </w:pPr>
+            <w:r>
+              <w:rPr>
+                <w:rFonts w:ascii="Times New Roman" w:hAnsi="Times New Roman"/>
+                <w:i w:val="0"/>
+                <w:iCs/>
+                <w:sz w:val="24"/>
+                <w:szCs w:val="24"/>
+              </w:rPr>
+              <w:t>Plots nearby veterinary clinics on the map view.</w:t>
+            </w:r>
+          </w:p>
+        </w:tc>
+      </w:tr>
+    </w:tbl>
+    <w:p/>
+    <w:p>
+      <w:pPr>
+        <w:pStyle w:val="Heading3"/>
+      </w:pPr>
+      <w:r>
+        <w:t>Notification Module</w:t>
+      </w:r>
+    </w:p>
+    <w:p>
+      <w:r>
+        <w:t>Purpose:</w:t>
+      </w:r>
+    </w:p>
+    <w:p/>
+    <w:p>
+      <w:r>
+        <w:t>Manages push, web socket, and email alerts.</w:t>
+      </w:r>
+    </w:p>
+    <w:p/>
+    <w:p>
+      <w:pPr>
+        <w:pStyle w:val="template"/>
+        <w:jc w:val="both"/>
+        <w:rPr>
+          <w:rFonts w:ascii="Times New Roman" w:hAnsi="Times New Roman"/>
+          <w:b/>
+          <w:bCs/>
+          <w:i w:val="0"/>
+          <w:sz w:val="24"/>
+        </w:rPr>
+      </w:pPr>
+      <w:r>
+        <w:rPr>
+          <w:rFonts w:ascii="Times New Roman" w:hAnsi="Times New Roman"/>
+          <w:b/>
+          <w:bCs/>
+          <w:i w:val="0"/>
+          <w:sz w:val="24"/>
+        </w:rPr>
+        <w:t>Sub-Modules &amp; Descriptions</w:t>
+      </w:r>
+    </w:p>
+    <w:p>
+      <w:pPr>
+        <w:pStyle w:val="template"/>
+        <w:jc w:val="both"/>
+        <w:rPr>
+          <w:rFonts w:ascii="Times" w:hAnsi="Times"/>
+          <w:i w:val="0"/>
+          <w:sz w:val="24"/>
+        </w:rPr>
+      </w:pPr>
+    </w:p>
+    <w:tbl>
+      <w:tblPr>
+        <w:tblStyle w:val="TableGrid"/>
+        <w:tblW w:w="0" w:type="auto"/>
+        <w:tblLook w:val="04A0" w:firstRow="1" w:lastRow="0" w:firstColumn="1" w:lastColumn="0" w:noHBand="0" w:noVBand="1"/>
+      </w:tblPr>
+      <w:tblGrid>
+        <w:gridCol w:w="4963"/>
+        <w:gridCol w:w="4963"/>
+      </w:tblGrid>
+      <w:tr>
+        <w:trPr>
+          <w:trHeight w:val="323"/>
+        </w:trPr>
+        <w:tc>
+          <w:tcPr>
+            <w:tcW w:w="4963" w:type="dxa"/>
+          </w:tcPr>
+          <w:p>
+            <w:pPr>
+              <w:pStyle w:val="template"/>
+              <w:tabs>
+                <w:tab w:val="left" w:pos="3090"/>
+              </w:tabs>
+              <w:jc w:val="both"/>
+              <w:rPr>
+                <w:rFonts w:asciiTheme="majorBidi" w:hAnsiTheme="majorBidi" w:cstheme="majorBidi"/>
+                <w:b/>
+                <w:bCs/>
+                <w:i w:val="0"/>
+                <w:iCs/>
+                <w:sz w:val="24"/>
+                <w:szCs w:val="24"/>
+              </w:rPr>
+            </w:pPr>
+            <w:r>
+              <w:rPr>
+                <w:rFonts w:asciiTheme="majorBidi" w:hAnsiTheme="majorBidi" w:cstheme="majorBidi"/>
+                <w:b/>
+                <w:bCs/>
+                <w:i w:val="0"/>
+                <w:iCs/>
+                <w:sz w:val="24"/>
+                <w:szCs w:val="24"/>
+              </w:rPr>
+              <w:tab/>
+              <w:t>Sub-Module</w:t>
+            </w:r>
+          </w:p>
+        </w:tc>
+        <w:tc>
+          <w:tcPr>
+            <w:tcW w:w="4963" w:type="dxa"/>
+          </w:tcPr>
+          <w:p>
+            <w:pPr>
+              <w:pStyle w:val="template"/>
+              <w:jc w:val="center"/>
+              <w:rPr>
+                <w:rFonts w:asciiTheme="majorBidi" w:hAnsiTheme="majorBidi" w:cstheme="majorBidi"/>
+                <w:b/>
+                <w:bCs/>
+                <w:i w:val="0"/>
+                <w:iCs/>
+                <w:sz w:val="24"/>
+                <w:szCs w:val="24"/>
+              </w:rPr>
+            </w:pPr>
+            <w:r>
+              <w:rPr>
+                <w:rFonts w:asciiTheme="majorBidi" w:hAnsiTheme="majorBidi" w:cstheme="majorBidi"/>
+                <w:b/>
+                <w:bCs/>
+                <w:i w:val="0"/>
+                <w:iCs/>
+                <w:sz w:val="24"/>
+                <w:szCs w:val="24"/>
+              </w:rPr>
+              <w:t>Functional Description</w:t>
+            </w:r>
+          </w:p>
+        </w:tc>
+      </w:tr>
+      <w:tr>
+        <w:trPr>
+          <w:trHeight w:val="440"/>
+        </w:trPr>
+        <w:tc>
+          <w:tcPr>
+            <w:tcW w:w="4963" w:type="dxa"/>
+          </w:tcPr>
+          <w:p>
+            <w:pPr>
+              <w:pStyle w:val="template"/>
+              <w:tabs>
+                <w:tab w:val="left" w:pos="2865"/>
+              </w:tabs>
+              <w:rPr>
+                <w:rFonts w:ascii="Times New Roman" w:hAnsi="Times New Roman"/>
+                <w:i w:val="0"/>
+                <w:sz w:val="24"/>
+                <w:szCs w:val="24"/>
+              </w:rPr>
+            </w:pPr>
+            <w:r>
+              <w:rPr>
+                <w:rFonts w:ascii="Times New Roman" w:hAnsi="Times New Roman"/>
+                <w:i w:val="0"/>
+                <w:sz w:val="24"/>
+                <w:szCs w:val="24"/>
+              </w:rPr>
+              <w:t xml:space="preserve">FCM Integrator </w:t>
+            </w:r>
+          </w:p>
+        </w:tc>
+        <w:tc>
+          <w:tcPr>
+            <w:tcW w:w="4963" w:type="dxa"/>
+          </w:tcPr>
+          <w:p>
+            <w:pPr>
+              <w:pStyle w:val="template"/>
+              <w:jc w:val="both"/>
+              <w:rPr>
+                <w:rFonts w:ascii="Times New Roman" w:hAnsi="Times New Roman"/>
+                <w:i w:val="0"/>
+                <w:sz w:val="24"/>
+                <w:szCs w:val="24"/>
+              </w:rPr>
+            </w:pPr>
+            <w:r>
+              <w:rPr>
+                <w:rFonts w:ascii="Times New Roman" w:hAnsi="Times New Roman"/>
+                <w:i w:val="0"/>
+                <w:sz w:val="24"/>
+                <w:szCs w:val="24"/>
+              </w:rPr>
+              <w:t>Sends push notifications to mobile devices.</w:t>
+            </w:r>
+          </w:p>
+        </w:tc>
+      </w:tr>
+      <w:tr>
+        <w:trPr>
+          <w:trHeight w:val="593"/>
+        </w:trPr>
+        <w:tc>
+          <w:tcPr>
+            <w:tcW w:w="4963" w:type="dxa"/>
+          </w:tcPr>
+          <w:p>
+            <w:pPr>
+              <w:pStyle w:val="template"/>
+              <w:tabs>
+                <w:tab w:val="left" w:pos="3600"/>
+              </w:tabs>
+              <w:rPr>
+                <w:rFonts w:ascii="Times New Roman" w:hAnsi="Times New Roman"/>
+                <w:i w:val="0"/>
+                <w:sz w:val="24"/>
+                <w:szCs w:val="24"/>
+              </w:rPr>
+            </w:pPr>
+            <w:r>
+              <w:rPr>
+                <w:rFonts w:ascii="Times New Roman" w:hAnsi="Times New Roman"/>
+                <w:i w:val="0"/>
+                <w:sz w:val="24"/>
+                <w:szCs w:val="24"/>
+              </w:rPr>
+              <w:t>Mail Sender</w:t>
+            </w:r>
+          </w:p>
+        </w:tc>
+        <w:tc>
+          <w:tcPr>
+            <w:tcW w:w="4963" w:type="dxa"/>
+          </w:tcPr>
+          <w:p>
+            <w:pPr>
+              <w:pStyle w:val="template"/>
+              <w:jc w:val="both"/>
+              <w:rPr>
+                <w:rFonts w:ascii="Times New Roman" w:hAnsi="Times New Roman"/>
+                <w:i w:val="0"/>
+                <w:sz w:val="24"/>
+                <w:szCs w:val="24"/>
+              </w:rPr>
+            </w:pPr>
+            <w:r>
+              <w:rPr>
+                <w:rFonts w:ascii="Times New Roman" w:hAnsi="Times New Roman"/>
+                <w:i w:val="0"/>
+                <w:sz w:val="24"/>
+                <w:szCs w:val="24"/>
+              </w:rPr>
+              <w:t>Sends HTML-formatted emails via SMTP.</w:t>
+            </w:r>
+          </w:p>
+        </w:tc>
+      </w:tr>
+      <w:tr>
+        <w:trPr>
+          <w:trHeight w:val="386"/>
+        </w:trPr>
+        <w:tc>
+          <w:tcPr>
+            <w:tcW w:w="4963" w:type="dxa"/>
+          </w:tcPr>
+          <w:p>
+            <w:pPr>
+              <w:pStyle w:val="template"/>
+              <w:tabs>
+                <w:tab w:val="left" w:pos="3600"/>
+              </w:tabs>
+              <w:jc w:val="both"/>
+              <w:rPr>
+                <w:rFonts w:ascii="Times New Roman" w:hAnsi="Times New Roman"/>
+                <w:i w:val="0"/>
+                <w:sz w:val="24"/>
+                <w:szCs w:val="24"/>
+              </w:rPr>
+            </w:pPr>
+            <w:r>
+              <w:rPr>
+                <w:rFonts w:ascii="Times New Roman" w:hAnsi="Times New Roman"/>
+                <w:i w:val="0"/>
+                <w:sz w:val="24"/>
+                <w:szCs w:val="24"/>
+              </w:rPr>
+              <w:t>Web Socket Service</w:t>
+            </w:r>
+          </w:p>
+        </w:tc>
+        <w:tc>
+          <w:tcPr>
+            <w:tcW w:w="4963" w:type="dxa"/>
+          </w:tcPr>
+          <w:p>
+            <w:pPr>
+              <w:pStyle w:val="template"/>
+              <w:jc w:val="both"/>
+              <w:rPr>
+                <w:rFonts w:ascii="Times New Roman" w:hAnsi="Times New Roman"/>
+                <w:i w:val="0"/>
+                <w:sz w:val="24"/>
+                <w:szCs w:val="24"/>
+              </w:rPr>
+            </w:pPr>
+            <w:r>
+              <w:rPr>
+                <w:rFonts w:ascii="Times New Roman" w:hAnsi="Times New Roman"/>
+                <w:i w:val="0"/>
+                <w:sz w:val="24"/>
+                <w:szCs w:val="24"/>
+              </w:rPr>
+              <w:t>Sends real-time alerts to active frontend sessions.</w:t>
+            </w:r>
+          </w:p>
+        </w:tc>
+      </w:tr>
+    </w:tbl>
+    <w:p/>
+    <w:p>
+      <w:pPr>
+        <w:pStyle w:val="Heading3"/>
+      </w:pPr>
+      <w:r>
+        <w:t>Data Processing Modules</w:t>
+      </w:r>
+    </w:p>
+    <w:p>
+      <w:pPr>
+        <w:rPr>
+          <w:b/>
+          <w:bCs/>
+        </w:rPr>
+      </w:pPr>
+      <w:r>
+        <w:rPr>
+          <w:b/>
+          <w:bCs/>
+        </w:rPr>
+        <w:t>Purpose:</w:t>
+      </w:r>
+    </w:p>
+    <w:p/>
+    <w:p>
+      <w:r>
+        <w:t>Handles database read and write tasks</w:t>
+      </w:r>
+    </w:p>
+    <w:p/>
+    <w:p>
+      <w:pPr>
+        <w:pStyle w:val="template"/>
+        <w:jc w:val="both"/>
+        <w:rPr>
+          <w:rFonts w:ascii="Times New Roman" w:hAnsi="Times New Roman"/>
+          <w:b/>
+          <w:bCs/>
+          <w:i w:val="0"/>
+          <w:sz w:val="24"/>
+        </w:rPr>
+      </w:pPr>
+      <w:r>
+        <w:rPr>
+          <w:rFonts w:ascii="Times New Roman" w:hAnsi="Times New Roman"/>
+          <w:b/>
+          <w:bCs/>
+          <w:i w:val="0"/>
+          <w:sz w:val="24"/>
+        </w:rPr>
+        <w:t>Sub-Modules &amp; Descriptions</w:t>
+      </w:r>
+    </w:p>
+    <w:p>
+      <w:pPr>
+        <w:pStyle w:val="template"/>
+        <w:jc w:val="both"/>
+        <w:rPr>
+          <w:rFonts w:ascii="Times" w:hAnsi="Times"/>
+          <w:i w:val="0"/>
+          <w:sz w:val="24"/>
+        </w:rPr>
+      </w:pPr>
+    </w:p>
+    <w:tbl>
+      <w:tblPr>
+        <w:tblStyle w:val="TableGrid"/>
+        <w:tblW w:w="0" w:type="auto"/>
+        <w:tblLook w:val="04A0" w:firstRow="1" w:lastRow="0" w:firstColumn="1" w:lastColumn="0" w:noHBand="0" w:noVBand="1"/>
+      </w:tblPr>
+      <w:tblGrid>
+        <w:gridCol w:w="4963"/>
+        <w:gridCol w:w="4963"/>
+      </w:tblGrid>
+      <w:tr>
+        <w:trPr>
+          <w:trHeight w:val="323"/>
+        </w:trPr>
+        <w:tc>
+          <w:tcPr>
+            <w:tcW w:w="4963" w:type="dxa"/>
+          </w:tcPr>
+          <w:p>
+            <w:pPr>
+              <w:pStyle w:val="template"/>
+              <w:tabs>
+                <w:tab w:val="left" w:pos="3090"/>
+              </w:tabs>
+              <w:jc w:val="both"/>
+              <w:rPr>
+                <w:rFonts w:asciiTheme="majorBidi" w:hAnsiTheme="majorBidi" w:cstheme="majorBidi"/>
+                <w:b/>
+                <w:bCs/>
+                <w:i w:val="0"/>
+                <w:iCs/>
+                <w:sz w:val="24"/>
+                <w:szCs w:val="24"/>
+              </w:rPr>
+            </w:pPr>
+            <w:r>
+              <w:rPr>
+                <w:rFonts w:asciiTheme="majorBidi" w:hAnsiTheme="majorBidi" w:cstheme="majorBidi"/>
+                <w:b/>
+                <w:bCs/>
+                <w:i w:val="0"/>
+                <w:iCs/>
+                <w:sz w:val="24"/>
+                <w:szCs w:val="24"/>
+              </w:rPr>
+              <w:tab/>
+              <w:t>Sub-Module</w:t>
+            </w:r>
+          </w:p>
+        </w:tc>
+        <w:tc>
+          <w:tcPr>
+            <w:tcW w:w="4963" w:type="dxa"/>
+          </w:tcPr>
+          <w:p>
+            <w:pPr>
+              <w:pStyle w:val="template"/>
+              <w:jc w:val="center"/>
+              <w:rPr>
+                <w:rFonts w:asciiTheme="majorBidi" w:hAnsiTheme="majorBidi" w:cstheme="majorBidi"/>
+                <w:b/>
+                <w:bCs/>
+                <w:i w:val="0"/>
+                <w:iCs/>
+                <w:sz w:val="24"/>
+                <w:szCs w:val="24"/>
+              </w:rPr>
+            </w:pPr>
+            <w:r>
+              <w:rPr>
+                <w:rFonts w:asciiTheme="majorBidi" w:hAnsiTheme="majorBidi" w:cstheme="majorBidi"/>
+                <w:b/>
+                <w:bCs/>
+                <w:i w:val="0"/>
+                <w:iCs/>
+                <w:sz w:val="24"/>
+                <w:szCs w:val="24"/>
+              </w:rPr>
+              <w:t>Functional Description</w:t>
+            </w:r>
+          </w:p>
+        </w:tc>
+      </w:tr>
+      <w:tr>
+        <w:trPr>
+          <w:trHeight w:val="440"/>
+        </w:trPr>
+        <w:tc>
+          <w:tcPr>
+            <w:tcW w:w="4963" w:type="dxa"/>
+          </w:tcPr>
+          <w:p>
+            <w:pPr>
+              <w:pStyle w:val="template"/>
+              <w:tabs>
+                <w:tab w:val="left" w:pos="2865"/>
+              </w:tabs>
+              <w:rPr>
+                <w:rFonts w:ascii="Times New Roman" w:hAnsi="Times New Roman"/>
+                <w:i w:val="0"/>
+                <w:iCs/>
+                <w:sz w:val="24"/>
+                <w:szCs w:val="24"/>
+              </w:rPr>
+            </w:pPr>
+            <w:r>
+              <w:rPr>
+                <w:rFonts w:ascii="Times New Roman" w:hAnsi="Times New Roman"/>
+                <w:i w:val="0"/>
+                <w:iCs/>
+                <w:sz w:val="24"/>
+                <w:szCs w:val="24"/>
+              </w:rPr>
+              <w:t> Schema Validator</w:t>
+            </w:r>
+          </w:p>
+          <w:p>
+            <w:pPr>
+              <w:pStyle w:val="template"/>
+              <w:tabs>
+                <w:tab w:val="left" w:pos="2865"/>
+              </w:tabs>
+              <w:rPr>
+                <w:rFonts w:ascii="Times New Roman" w:hAnsi="Times New Roman"/>
+                <w:i w:val="0"/>
+                <w:iCs/>
+                <w:sz w:val="24"/>
+                <w:szCs w:val="24"/>
+              </w:rPr>
+            </w:pPr>
+            <w:r>
+              <w:rPr>
+                <w:rFonts w:ascii="Times New Roman" w:hAnsi="Times New Roman"/>
+                <w:i w:val="0"/>
+                <w:iCs/>
+                <w:sz w:val="24"/>
+                <w:szCs w:val="24"/>
+              </w:rPr>
+              <w:t xml:space="preserve"> </w:t>
+            </w:r>
+          </w:p>
+          <w:p>
+            <w:pPr>
+              <w:pStyle w:val="template"/>
+              <w:tabs>
+                <w:tab w:val="left" w:pos="2865"/>
+              </w:tabs>
+              <w:rPr>
+                <w:rFonts w:ascii="Times New Roman" w:hAnsi="Times New Roman"/>
+                <w:i w:val="0"/>
+                <w:iCs/>
+                <w:sz w:val="24"/>
+                <w:szCs w:val="24"/>
+              </w:rPr>
+            </w:pPr>
+          </w:p>
+        </w:tc>
+        <w:tc>
+          <w:tcPr>
+            <w:tcW w:w="4963" w:type="dxa"/>
+          </w:tcPr>
+          <w:p>
+            <w:pPr>
+              <w:pStyle w:val="template"/>
+              <w:jc w:val="both"/>
+              <w:rPr>
+                <w:rFonts w:ascii="Times New Roman" w:hAnsi="Times New Roman"/>
+                <w:i w:val="0"/>
+                <w:iCs/>
+                <w:sz w:val="24"/>
+                <w:szCs w:val="24"/>
+              </w:rPr>
+            </w:pPr>
+            <w:r>
+              <w:rPr>
+                <w:rFonts w:ascii="Times New Roman" w:hAnsi="Times New Roman"/>
+                <w:i w:val="0"/>
+                <w:iCs/>
+                <w:sz w:val="24"/>
+                <w:szCs w:val="24"/>
+              </w:rPr>
+              <w:t>Validates model data formats using Mongoose templates</w:t>
+            </w:r>
+          </w:p>
+        </w:tc>
+      </w:tr>
+      <w:tr>
+        <w:trPr>
+          <w:trHeight w:val="593"/>
+        </w:trPr>
+        <w:tc>
+          <w:tcPr>
+            <w:tcW w:w="4963" w:type="dxa"/>
+          </w:tcPr>
+          <w:p>
+            <w:pPr>
+              <w:pStyle w:val="template"/>
+              <w:tabs>
+                <w:tab w:val="left" w:pos="3600"/>
+              </w:tabs>
+              <w:rPr>
+                <w:rFonts w:ascii="Times New Roman" w:hAnsi="Times New Roman"/>
+                <w:i w:val="0"/>
+                <w:iCs/>
+                <w:sz w:val="24"/>
+                <w:szCs w:val="24"/>
+              </w:rPr>
+            </w:pPr>
+            <w:r>
+              <w:rPr>
+                <w:rFonts w:ascii="Times New Roman" w:hAnsi="Times New Roman"/>
+                <w:i w:val="0"/>
+                <w:iCs/>
+                <w:sz w:val="24"/>
+                <w:szCs w:val="24"/>
+              </w:rPr>
+              <w:t>DB Connector</w:t>
+            </w:r>
+          </w:p>
+        </w:tc>
+        <w:tc>
+          <w:tcPr>
+            <w:tcW w:w="4963" w:type="dxa"/>
+          </w:tcPr>
+          <w:p>
+            <w:pPr>
+              <w:pStyle w:val="template"/>
+              <w:jc w:val="both"/>
+              <w:rPr>
+                <w:rFonts w:ascii="Times New Roman" w:hAnsi="Times New Roman"/>
+                <w:i w:val="0"/>
+                <w:iCs/>
+                <w:sz w:val="24"/>
+                <w:szCs w:val="24"/>
+              </w:rPr>
+            </w:pPr>
+            <w:r>
+              <w:rPr>
+                <w:rFonts w:ascii="Times New Roman" w:hAnsi="Times New Roman"/>
+                <w:i w:val="0"/>
+                <w:iCs/>
+                <w:sz w:val="24"/>
+                <w:szCs w:val="24"/>
+              </w:rPr>
+              <w:t>Maintains connection pools to the cloud database</w:t>
+            </w:r>
+          </w:p>
+        </w:tc>
+      </w:tr>
+    </w:tbl>
+    <w:p/>
+    <w:p/>
+    <w:p/>
+    <w:p/>
+    <w:p/>
+    <w:p/>
+    <w:p/>
+    <w:p>
+      <w:pPr>
+        <w:pStyle w:val="Heading3"/>
+      </w:pPr>
+      <w:r>
+        <w:lastRenderedPageBreak/>
+        <w:t>API Layer</w:t>
+      </w:r>
+    </w:p>
+    <w:p>
+      <w:pPr>
+        <w:rPr>
+          <w:b/>
+          <w:bCs/>
+        </w:rPr>
+      </w:pPr>
+      <w:r>
+        <w:rPr>
+          <w:b/>
+          <w:bCs/>
+        </w:rPr>
+        <w:t>Purpose:</w:t>
+      </w:r>
+    </w:p>
+    <w:p/>
+    <w:p>
+      <w:r>
+        <w:t>Manages integrations with external services.</w:t>
+      </w:r>
+    </w:p>
+    <w:p/>
+    <w:p>
+      <w:pPr>
+        <w:pStyle w:val="template"/>
+        <w:jc w:val="both"/>
+        <w:rPr>
+          <w:rFonts w:ascii="Times New Roman" w:hAnsi="Times New Roman"/>
+          <w:b/>
+          <w:bCs/>
+          <w:i w:val="0"/>
+          <w:sz w:val="24"/>
+        </w:rPr>
+      </w:pPr>
+      <w:r>
+        <w:rPr>
+          <w:rFonts w:ascii="Times New Roman" w:hAnsi="Times New Roman"/>
+          <w:b/>
+          <w:bCs/>
+          <w:i w:val="0"/>
+          <w:sz w:val="24"/>
+        </w:rPr>
+        <w:t>Sub-Modules &amp; Descriptions</w:t>
+      </w:r>
+    </w:p>
+    <w:p>
+      <w:pPr>
+        <w:pStyle w:val="template"/>
+        <w:jc w:val="both"/>
+        <w:rPr>
+          <w:rFonts w:ascii="Times" w:hAnsi="Times"/>
+          <w:i w:val="0"/>
+          <w:sz w:val="24"/>
+        </w:rPr>
+      </w:pPr>
+    </w:p>
+    <w:tbl>
+      <w:tblPr>
+        <w:tblStyle w:val="TableGrid"/>
+        <w:tblW w:w="0" w:type="auto"/>
+        <w:tblLook w:val="04A0" w:firstRow="1" w:lastRow="0" w:firstColumn="1" w:lastColumn="0" w:noHBand="0" w:noVBand="1"/>
+      </w:tblPr>
+      <w:tblGrid>
+        <w:gridCol w:w="4963"/>
+        <w:gridCol w:w="4963"/>
+      </w:tblGrid>
+      <w:tr>
+        <w:trPr>
+          <w:trHeight w:val="323"/>
+        </w:trPr>
+        <w:tc>
+          <w:tcPr>
+            <w:tcW w:w="4963" w:type="dxa"/>
+          </w:tcPr>
+          <w:p>
+            <w:pPr>
+              <w:pStyle w:val="template"/>
+              <w:tabs>
+                <w:tab w:val="left" w:pos="3090"/>
+              </w:tabs>
+              <w:jc w:val="both"/>
+              <w:rPr>
+                <w:rFonts w:asciiTheme="majorBidi" w:hAnsiTheme="majorBidi" w:cstheme="majorBidi"/>
+                <w:b/>
+                <w:bCs/>
+                <w:i w:val="0"/>
+                <w:iCs/>
+                <w:sz w:val="24"/>
+                <w:szCs w:val="24"/>
+              </w:rPr>
+            </w:pPr>
+            <w:r>
+              <w:rPr>
+                <w:rFonts w:asciiTheme="majorBidi" w:hAnsiTheme="majorBidi" w:cstheme="majorBidi"/>
+                <w:b/>
+                <w:bCs/>
+                <w:i w:val="0"/>
+                <w:iCs/>
+                <w:sz w:val="24"/>
+                <w:szCs w:val="24"/>
+              </w:rPr>
+              <w:tab/>
+              <w:t>Sub-Module</w:t>
+            </w:r>
+          </w:p>
+        </w:tc>
+        <w:tc>
+          <w:tcPr>
+            <w:tcW w:w="4963" w:type="dxa"/>
+          </w:tcPr>
+          <w:p>
+            <w:pPr>
+              <w:pStyle w:val="template"/>
+              <w:jc w:val="center"/>
+              <w:rPr>
+                <w:rFonts w:asciiTheme="majorBidi" w:hAnsiTheme="majorBidi" w:cstheme="majorBidi"/>
+                <w:b/>
+                <w:bCs/>
+                <w:i w:val="0"/>
+                <w:iCs/>
+                <w:sz w:val="24"/>
+                <w:szCs w:val="24"/>
+              </w:rPr>
+            </w:pPr>
+            <w:r>
+              <w:rPr>
+                <w:rFonts w:asciiTheme="majorBidi" w:hAnsiTheme="majorBidi" w:cstheme="majorBidi"/>
+                <w:b/>
+                <w:bCs/>
+                <w:i w:val="0"/>
+                <w:iCs/>
+                <w:sz w:val="24"/>
+                <w:szCs w:val="24"/>
+              </w:rPr>
+              <w:t>Functional Description</w:t>
+            </w:r>
+          </w:p>
+        </w:tc>
+      </w:tr>
+      <w:tr>
+        <w:trPr>
+          <w:trHeight w:val="440"/>
+        </w:trPr>
+        <w:tc>
+          <w:tcPr>
+            <w:tcW w:w="4963" w:type="dxa"/>
+          </w:tcPr>
+          <w:p>
+            <w:pPr>
+              <w:pStyle w:val="template"/>
+              <w:tabs>
+                <w:tab w:val="left" w:pos="2865"/>
+              </w:tabs>
+              <w:rPr>
+                <w:rFonts w:ascii="Times New Roman" w:hAnsi="Times New Roman"/>
+                <w:i w:val="0"/>
+                <w:sz w:val="24"/>
+                <w:szCs w:val="24"/>
+              </w:rPr>
+            </w:pPr>
+            <w:r>
+              <w:rPr>
+                <w:rFonts w:ascii="Times New Roman" w:hAnsi="Times New Roman"/>
+                <w:i w:val="0"/>
+                <w:sz w:val="24"/>
+                <w:szCs w:val="24"/>
+              </w:rPr>
+              <w:t> </w:t>
+            </w:r>
+            <w:r>
+              <w:rPr>
+                <w:rFonts w:ascii="Times New Roman" w:hAnsi="Times New Roman"/>
+                <w:i w:val="0"/>
+                <w:sz w:val="24"/>
+                <w:szCs w:val="24"/>
+              </w:rPr>
+              <w:t xml:space="preserve">Third-Party Handshakes </w:t>
+            </w:r>
+          </w:p>
+          <w:p>
+            <w:pPr>
+              <w:pStyle w:val="template"/>
+              <w:tabs>
+                <w:tab w:val="left" w:pos="2865"/>
+              </w:tabs>
+              <w:rPr>
+                <w:rFonts w:ascii="Times New Roman" w:hAnsi="Times New Roman"/>
+                <w:i w:val="0"/>
+                <w:sz w:val="24"/>
+                <w:szCs w:val="24"/>
+              </w:rPr>
+            </w:pPr>
+          </w:p>
+          <w:p>
+            <w:pPr>
+              <w:pStyle w:val="template"/>
+              <w:tabs>
+                <w:tab w:val="left" w:pos="2865"/>
+              </w:tabs>
+              <w:rPr>
+                <w:rFonts w:ascii="Times New Roman" w:hAnsi="Times New Roman"/>
+                <w:i w:val="0"/>
+                <w:sz w:val="24"/>
+                <w:szCs w:val="24"/>
+              </w:rPr>
+            </w:pPr>
+            <w:r>
+              <w:rPr>
+                <w:rFonts w:ascii="Times New Roman" w:hAnsi="Times New Roman"/>
+                <w:i w:val="0"/>
+                <w:sz w:val="24"/>
+                <w:szCs w:val="24"/>
+              </w:rPr>
+              <w:t xml:space="preserve"> </w:t>
+            </w:r>
+          </w:p>
+          <w:p>
+            <w:pPr>
+              <w:pStyle w:val="template"/>
+              <w:tabs>
+                <w:tab w:val="left" w:pos="2865"/>
+              </w:tabs>
+              <w:rPr>
+                <w:rFonts w:ascii="Times New Roman" w:hAnsi="Times New Roman"/>
+                <w:i w:val="0"/>
+                <w:sz w:val="24"/>
+                <w:szCs w:val="24"/>
+              </w:rPr>
+            </w:pPr>
+          </w:p>
+        </w:tc>
+        <w:tc>
+          <w:tcPr>
+            <w:tcW w:w="4963" w:type="dxa"/>
+          </w:tcPr>
+          <w:p>
+            <w:pPr>
+              <w:pStyle w:val="template"/>
+              <w:jc w:val="both"/>
+              <w:rPr>
+                <w:rFonts w:ascii="Times New Roman" w:hAnsi="Times New Roman"/>
+                <w:i w:val="0"/>
+                <w:sz w:val="24"/>
+                <w:szCs w:val="24"/>
+              </w:rPr>
+            </w:pPr>
+            <w:r>
+              <w:rPr>
+                <w:rFonts w:ascii="Times New Roman" w:hAnsi="Times New Roman"/>
+                <w:i w:val="0"/>
+                <w:sz w:val="24"/>
+                <w:szCs w:val="24"/>
+              </w:rPr>
+              <w:t xml:space="preserve">Coordinates API requests to Stripe, Google Maps, and </w:t>
+            </w:r>
+            <w:r>
+              <w:rPr>
+                <w:rFonts w:ascii="Times New Roman" w:hAnsi="Times New Roman"/>
+                <w:i w:val="0"/>
+                <w:sz w:val="24"/>
+                <w:szCs w:val="24"/>
+              </w:rPr>
+              <w:t>Open LLM for Rag</w:t>
+            </w:r>
+            <w:r>
+              <w:rPr>
+                <w:rFonts w:ascii="Times New Roman" w:hAnsi="Times New Roman"/>
+                <w:i w:val="0"/>
+                <w:sz w:val="24"/>
+                <w:szCs w:val="24"/>
+              </w:rPr>
+              <w:t>.</w:t>
+            </w:r>
+          </w:p>
+        </w:tc>
+      </w:tr>
+    </w:tbl>
+    <w:p/>
+    <w:p>
+      <w:pPr>
+        <w:pStyle w:val="Heading2"/>
+        <w:rPr>
+          <w:rFonts w:asciiTheme="majorBidi" w:hAnsiTheme="majorBidi" w:cstheme="majorBidi"/>
+        </w:rPr>
+      </w:pPr>
+      <w:bookmarkStart w:id="27" w:name="_Toc228796710"/>
+      <w:r>
+        <w:rPr>
+          <w:rFonts w:asciiTheme="majorBidi" w:hAnsiTheme="majorBidi" w:cstheme="majorBidi"/>
+        </w:rPr>
+        <w:t>Data Flow Description</w:t>
+      </w:r>
+      <w:bookmarkEnd w:id="27"/>
+    </w:p>
+    <w:p>
+      <w:pPr>
+        <w:pStyle w:val="template"/>
+        <w:jc w:val="both"/>
+        <w:rPr>
+          <w:rFonts w:asciiTheme="majorBidi" w:hAnsiTheme="majorBidi" w:cstheme="majorBidi"/>
+        </w:rPr>
+      </w:pPr>
+      <w:r>
+        <w:rPr>
+          <w:rFonts w:asciiTheme="majorBidi" w:hAnsiTheme="majorBidi" w:cstheme="majorBidi"/>
+        </w:rPr>
+        <w:t>&lt;Describe how data moves through the system. For example: "User enters credentials -&gt; Auth Module checks DB -&gt; Token is returned to UI."&gt;</w:t>
+      </w:r>
+    </w:p>
+    <w:p>
+      <w:pPr>
+        <w:pStyle w:val="template"/>
+        <w:jc w:val="both"/>
+        <w:rPr>
+          <w:rFonts w:asciiTheme="majorBidi" w:hAnsiTheme="majorBidi" w:cstheme="majorBidi"/>
+        </w:rPr>
+      </w:pPr>
+    </w:p>
+    <w:p>
+      <w:pPr>
+        <w:pStyle w:val="template"/>
+        <w:jc w:val="both"/>
+        <w:rPr>
+          <w:rFonts w:asciiTheme="majorBidi" w:hAnsiTheme="majorBidi" w:cstheme="majorBidi"/>
+        </w:rPr>
+      </w:pPr>
+    </w:p>
+    <w:p>
+      <w:pPr>
+        <w:pStyle w:val="template"/>
+        <w:jc w:val="both"/>
+        <w:rPr>
+          <w:rFonts w:asciiTheme="majorBidi" w:hAnsiTheme="majorBidi" w:cstheme="majorBidi"/>
+        </w:rPr>
+      </w:pPr>
+    </w:p>
+    <w:p>
+      <w:pPr>
+        <w:spacing w:line="240" w:lineRule="auto"/>
+        <w:rPr>
+          <w:rFonts w:asciiTheme="majorBidi" w:hAnsiTheme="majorBidi" w:cstheme="majorBidi"/>
+          <w:b/>
+          <w:kern w:val="28"/>
+          <w:sz w:val="36"/>
+        </w:rPr>
+      </w:pPr>
+      <w:r>
+        <w:rPr>
+          <w:rFonts w:asciiTheme="majorBidi" w:hAnsiTheme="majorBidi" w:cstheme="majorBidi"/>
+        </w:rPr>
+        <w:br w:type="page"/>
+      </w:r>
+    </w:p>
+    <w:p>
+      <w:pPr>
+        <w:pStyle w:val="Heading1"/>
+        <w:rPr>
+          <w:rFonts w:asciiTheme="majorBidi" w:hAnsiTheme="majorBidi" w:cstheme="majorBidi"/>
+        </w:rPr>
+      </w:pPr>
+      <w:bookmarkStart w:id="28" w:name="_Toc228796711"/>
+      <w:r>
+        <w:rPr>
+          <w:rFonts w:asciiTheme="majorBidi" w:hAnsiTheme="majorBidi" w:cstheme="majorBidi"/>
+        </w:rPr>
+        <w:lastRenderedPageBreak/>
+        <w:t>UML Diagrams</w:t>
+      </w:r>
+      <w:bookmarkEnd w:id="28"/>
     </w:p>
     <w:p>
       <w:pPr>
@@ -4651,8 +9040,22 @@
       <w:r>
         <w:rPr>
           <w:rFonts w:asciiTheme="majorBidi" w:hAnsiTheme="majorBidi" w:cstheme="majorBidi"/>
-        </w:rPr>
-        <w:t xml:space="preserve">Authentication Module </w:t>
+          <w:b/>
+        </w:rPr>
+        <w:t>Use Case Diagram</w:t>
+      </w:r>
+      <w:r>
+        <w:rPr>
+          <w:rFonts w:asciiTheme="majorBidi" w:hAnsiTheme="majorBidi" w:cstheme="majorBidi"/>
+        </w:rPr>
+        <w:t xml:space="preserve">: Shows how different users (Actors) interact with the system functions. </w:t>
+      </w:r>
+      <w:r>
+        <w:rPr>
+          <w:rFonts w:asciiTheme="majorBidi" w:hAnsiTheme="majorBidi" w:cstheme="majorBidi"/>
+          <w:b/>
+        </w:rPr>
+        <w:t>(optional)</w:t>
       </w:r>
     </w:p>
     <w:p>
@@ -4670,8 +9073,22 @@
       <w:r>
         <w:rPr>
           <w:rFonts w:asciiTheme="majorBidi" w:hAnsiTheme="majorBidi" w:cstheme="majorBidi"/>
-        </w:rPr>
-        <w:t xml:space="preserve">Data Processing Module </w:t>
+          <w:b/>
+        </w:rPr>
+        <w:t>Class Diagram:</w:t>
+      </w:r>
+      <w:r>
+        <w:rPr>
+          <w:rFonts w:asciiTheme="majorBidi" w:hAnsiTheme="majorBidi" w:cstheme="majorBidi"/>
+        </w:rPr>
+        <w:t xml:space="preserve"> The "skeleton" of your code. Show the objects, their attributes, methods, and how they relate (Inheritance, Association</w:t>
+      </w:r>
+      <w:r>
+        <w:rPr>
+          <w:rFonts w:asciiTheme="majorBidi" w:hAnsiTheme="majorBidi" w:cstheme="majorBidi"/>
+          <w:b/>
+        </w:rPr>
+        <w:t>). (Mandatory)</w:t>
       </w:r>
     </w:p>
     <w:p>
@@ -4689,67 +9106,23 @@
       <w:r>
         <w:rPr>
           <w:rFonts w:asciiTheme="majorBidi" w:hAnsiTheme="majorBidi" w:cstheme="majorBidi"/>
-        </w:rPr>
-        <w:t xml:space="preserve">API Layer </w:t>
-      </w:r>
-    </w:p>
-    <w:p>
-      <w:pPr>
-        <w:pStyle w:val="Heading2"/>
-        <w:rPr>
-          <w:rFonts w:asciiTheme="majorBidi" w:hAnsiTheme="majorBidi" w:cstheme="majorBidi"/>
-        </w:rPr>
-      </w:pPr>
-      <w:bookmarkStart w:id="27" w:name="_Toc228796710"/>
-      <w:r>
-        <w:rPr>
-          <w:rFonts w:asciiTheme="majorBidi" w:hAnsiTheme="majorBidi" w:cstheme="majorBidi"/>
-        </w:rPr>
-        <w:t>Data Flow Description</w:t>
-      </w:r>
-      <w:bookmarkEnd w:id="27"/>
-    </w:p>
-    <w:p>
-      <w:pPr>
-        <w:pStyle w:val="template"/>
-        <w:jc w:val="both"/>
-        <w:rPr>
-          <w:rFonts w:asciiTheme="majorBidi" w:hAnsiTheme="majorBidi" w:cstheme="majorBidi"/>
-        </w:rPr>
-      </w:pPr>
-      <w:r>
-        <w:rPr>
-          <w:rFonts w:asciiTheme="majorBidi" w:hAnsiTheme="majorBidi" w:cstheme="majorBidi"/>
-        </w:rPr>
-        <w:t>&lt;Describe how data moves through the system. For example: "User enters credentials -&gt; Auth Module checks DB -&gt; Token is returned to UI."&gt;</w:t>
-      </w:r>
-    </w:p>
-    <w:p>
-      <w:pPr>
-        <w:pStyle w:val="template"/>
-        <w:jc w:val="both"/>
-        <w:rPr>
-          <w:rFonts w:asciiTheme="majorBidi" w:hAnsiTheme="majorBidi" w:cstheme="majorBidi"/>
-        </w:rPr>
-      </w:pPr>
-    </w:p>
-    <w:p>
-      <w:pPr>
-        <w:pStyle w:val="template"/>
-        <w:jc w:val="both"/>
-        <w:rPr>
-          <w:rFonts w:asciiTheme="majorBidi" w:hAnsiTheme="majorBidi" w:cstheme="majorBidi"/>
-        </w:rPr>
-      </w:pPr>
-    </w:p>
-    <w:p>
-      <w:pPr>
-        <w:pStyle w:val="template"/>
-        <w:jc w:val="both"/>
-        <w:rPr>
-          <w:rFonts w:asciiTheme="majorBidi" w:hAnsiTheme="majorBidi" w:cstheme="majorBidi"/>
-        </w:rPr>
-      </w:pPr>
+          <w:b/>
+        </w:rPr>
+        <w:t>Sequence Diagram:</w:t>
+      </w:r>
+      <w:r>
+        <w:rPr>
+          <w:rFonts w:asciiTheme="majorBidi" w:hAnsiTheme="majorBidi" w:cstheme="majorBidi"/>
+        </w:rPr>
+        <w:t xml:space="preserve"> Shows the step-by-step logic over time. For one specific action (like "Purchase Item"), show the messages sent between the User, Controller, and Database. ). </w:t>
+      </w:r>
+      <w:r>
+        <w:rPr>
+          <w:rFonts w:asciiTheme="majorBidi" w:hAnsiTheme="majorBidi" w:cstheme="majorBidi"/>
+          <w:b/>
+        </w:rPr>
+        <w:t>(Mandatory)</w:t>
+      </w:r>
     </w:p>
     <w:p>
       <w:pPr>
@@ -4775,153 +9148,6 @@
           <w:rFonts w:asciiTheme="majorBidi" w:hAnsiTheme="majorBidi" w:cstheme="majorBidi"/>
         </w:rPr>
       </w:pPr>
-      <w:bookmarkStart w:id="28" w:name="_Toc228796711"/>
-      <w:r>
-        <w:rPr>
-          <w:rFonts w:asciiTheme="majorBidi" w:hAnsiTheme="majorBidi" w:cstheme="majorBidi"/>
-        </w:rPr>
-        <w:lastRenderedPageBreak/>
-        <w:t>UML Diagrams</w:t>
-      </w:r>
-      <w:bookmarkEnd w:id="28"/>
-    </w:p>
-    <w:p>
-      <w:pPr>
-        <w:pStyle w:val="template"/>
-        <w:numPr>
-          <w:ilvl w:val="0"/>
-          <w:numId w:val="19"/>
-        </w:numPr>
-        <w:jc w:val="both"/>
-        <w:rPr>
-          <w:rFonts w:asciiTheme="majorBidi" w:hAnsiTheme="majorBidi" w:cstheme="majorBidi"/>
-        </w:rPr>
-      </w:pPr>
-      <w:r>
-        <w:rPr>
-          <w:rFonts w:asciiTheme="majorBidi" w:hAnsiTheme="majorBidi" w:cstheme="majorBidi"/>
-          <w:b/>
-        </w:rPr>
-        <w:t>Use Case Diagram</w:t>
-      </w:r>
-      <w:r>
-        <w:rPr>
-          <w:rFonts w:asciiTheme="majorBidi" w:hAnsiTheme="majorBidi" w:cstheme="majorBidi"/>
-        </w:rPr>
-        <w:t xml:space="preserve">: Shows how different users (Actors) interact with the system functions. </w:t>
-      </w:r>
-      <w:r>
-        <w:rPr>
-          <w:rFonts w:asciiTheme="majorBidi" w:hAnsiTheme="majorBidi" w:cstheme="majorBidi"/>
-          <w:b/>
-        </w:rPr>
-        <w:t>(optional)</w:t>
-      </w:r>
-    </w:p>
-    <w:p>
-      <w:pPr>
-        <w:pStyle w:val="template"/>
-        <w:numPr>
-          <w:ilvl w:val="0"/>
-          <w:numId w:val="19"/>
-        </w:numPr>
-        <w:jc w:val="both"/>
-        <w:rPr>
-          <w:rFonts w:asciiTheme="majorBidi" w:hAnsiTheme="majorBidi" w:cstheme="majorBidi"/>
-        </w:rPr>
-      </w:pPr>
-      <w:r>
-        <w:rPr>
-          <w:rFonts w:asciiTheme="majorBidi" w:hAnsiTheme="majorBidi" w:cstheme="majorBidi"/>
-          <w:b/>
-        </w:rPr>
-        <w:t>Class Diagram:</w:t>
-      </w:r>
-      <w:r>
-        <w:rPr>
-          <w:rFonts w:asciiTheme="majorBidi" w:hAnsiTheme="majorBidi" w:cstheme="majorBidi"/>
-        </w:rPr>
-        <w:t xml:space="preserve"> The "skeleton" of your code. Show the objects, their attributes, methods, and how they relate (Inheritance, Association</w:t>
-      </w:r>
-      <w:r>
-        <w:rPr>
-          <w:rFonts w:asciiTheme="majorBidi" w:hAnsiTheme="majorBidi" w:cstheme="majorBidi"/>
-          <w:b/>
-        </w:rPr>
-        <w:t>). (Mandatory)</w:t>
-      </w:r>
-    </w:p>
-    <w:p>
-      <w:pPr>
-        <w:pStyle w:val="template"/>
-        <w:numPr>
-          <w:ilvl w:val="0"/>
-          <w:numId w:val="19"/>
-        </w:numPr>
-        <w:jc w:val="both"/>
-        <w:rPr>
-          <w:rFonts w:asciiTheme="majorBidi" w:hAnsiTheme="majorBidi" w:cstheme="majorBidi"/>
-        </w:rPr>
-      </w:pPr>
-      <w:r>
-        <w:rPr>
-          <w:rFonts w:asciiTheme="majorBidi" w:hAnsiTheme="majorBidi" w:cstheme="majorBidi"/>
-          <w:b/>
-        </w:rPr>
-        <w:t>Sequence Diagram:</w:t>
-      </w:r>
-      <w:r>
-        <w:rPr>
-          <w:rFonts w:asciiTheme="majorBidi" w:hAnsiTheme="majorBidi" w:cstheme="majorBidi"/>
-        </w:rPr>
-        <w:t xml:space="preserve"> Shows the step-by-step logic over time. For one specific action (like "Purchase Item"), show the messages sent between the User, Controller, and Database</w:t>
-      </w:r>
-      <w:proofErr w:type="gramStart"/>
-      <w:r>
-        <w:rPr>
-          <w:rFonts w:asciiTheme="majorBidi" w:hAnsiTheme="majorBidi" w:cstheme="majorBidi"/>
-        </w:rPr>
-        <w:t>. )</w:t>
-      </w:r>
-      <w:proofErr w:type="gramEnd"/>
-      <w:r>
-        <w:rPr>
-          <w:rFonts w:asciiTheme="majorBidi" w:hAnsiTheme="majorBidi" w:cstheme="majorBidi"/>
-        </w:rPr>
-        <w:t xml:space="preserve">. </w:t>
-      </w:r>
-      <w:r>
-        <w:rPr>
-          <w:rFonts w:asciiTheme="majorBidi" w:hAnsiTheme="majorBidi" w:cstheme="majorBidi"/>
-          <w:b/>
-        </w:rPr>
-        <w:t>(Mandatory)</w:t>
-      </w:r>
-    </w:p>
-    <w:p>
-      <w:pPr>
-        <w:spacing w:line="240" w:lineRule="auto"/>
-        <w:rPr>
-          <w:rFonts w:asciiTheme="majorBidi" w:hAnsiTheme="majorBidi" w:cstheme="majorBidi"/>
-          <w:b/>
-          <w:kern w:val="28"/>
-          <w:sz w:val="36"/>
-        </w:rPr>
-      </w:pPr>
-      <w:r>
-        <w:rPr>
-          <w:rFonts w:asciiTheme="majorBidi" w:hAnsiTheme="majorBidi" w:cstheme="majorBidi"/>
-        </w:rPr>
-        <w:br w:type="page"/>
-      </w:r>
-    </w:p>
-    <w:p>
-      <w:pPr>
-        <w:pStyle w:val="Heading1"/>
-        <w:rPr>
-          <w:rFonts w:asciiTheme="majorBidi" w:hAnsiTheme="majorBidi" w:cstheme="majorBidi"/>
-        </w:rPr>
-      </w:pPr>
       <w:bookmarkStart w:id="29" w:name="_Toc228796712"/>
       <w:r>
         <w:rPr>
@@ -5028,28 +9254,14 @@
         <w:rPr>
           <w:rFonts w:asciiTheme="majorBidi" w:hAnsiTheme="majorBidi" w:cstheme="majorBidi"/>
         </w:rPr>
-        <w:t>user_</w:t>
-      </w:r>
-      <w:proofErr w:type="gramStart"/>
-      <w:r>
-        <w:rPr>
-          <w:rFonts w:asciiTheme="majorBidi" w:hAnsiTheme="majorBidi" w:cstheme="majorBidi"/>
-        </w:rPr>
-        <w:t>id</w:t>
+        <w:t>user_id</w:t>
       </w:r>
       <w:proofErr w:type="spellEnd"/>
       <w:r>
         <w:rPr>
           <w:rFonts w:asciiTheme="majorBidi" w:hAnsiTheme="majorBidi" w:cstheme="majorBidi"/>
         </w:rPr>
-        <w:t xml:space="preserve"> :</w:t>
-      </w:r>
-      <w:proofErr w:type="gramEnd"/>
-      <w:r>
-        <w:rPr>
-          <w:rFonts w:asciiTheme="majorBidi" w:hAnsiTheme="majorBidi" w:cstheme="majorBidi"/>
-        </w:rPr>
-        <w:t xml:space="preserve"> INT, Primary Key).</w:t>
+        <w:t xml:space="preserve"> : INT, Primary Key).</w:t>
       </w:r>
       <w:r>
         <w:rPr>
@@ -6308,15 +10520,7 @@
                 <w:rFonts w:ascii="Times New Roman" w:hAnsi="Times New Roman"/>
                 <w:szCs w:val="24"/>
               </w:rPr>
-              <w:t>/shelters/bookings</w:t>
-            </w:r>
-            <w:proofErr w:type="gramStart"/>
-            <w:r>
-              <w:rPr>
-                <w:rFonts w:ascii="Times New Roman" w:hAnsi="Times New Roman"/>
-                <w:szCs w:val="24"/>
-              </w:rPr>
-              <w:t>/:</w:t>
+              <w:t>/shelters/bookings/:</w:t>
             </w:r>
             <w:proofErr w:type="spellStart"/>
             <w:r>
@@ -6327,7 +10531,6 @@
               <w:t>bookingId</w:t>
             </w:r>
             <w:proofErr w:type="spellEnd"/>
-            <w:proofErr w:type="gramEnd"/>
           </w:p>
         </w:tc>
         <w:tc>
@@ -6486,15 +10689,7 @@
                 <w:rFonts w:ascii="Times New Roman" w:hAnsi="Times New Roman"/>
                 <w:szCs w:val="24"/>
               </w:rPr>
-              <w:t>query</w:t>
-            </w:r>
-            <w:proofErr w:type="gramStart"/>
-            <w:r>
-              <w:rPr>
-                <w:rFonts w:ascii="Times New Roman" w:hAnsi="Times New Roman"/>
-                <w:szCs w:val="24"/>
-              </w:rPr>
-              <w:t>:</w:t>
+              <w:t>query:</w:t>
             </w:r>
             <w:r>
               <w:rPr>
@@ -6508,15 +10703,7 @@
                 <w:rFonts w:ascii="Times New Roman" w:hAnsi="Times New Roman"/>
                 <w:szCs w:val="24"/>
               </w:rPr>
-              <w:t>?category</w:t>
-            </w:r>
-            <w:proofErr w:type="gramEnd"/>
-            <w:r>
-              <w:rPr>
-                <w:rFonts w:ascii="Times New Roman" w:hAnsi="Times New Roman"/>
-                <w:szCs w:val="24"/>
-              </w:rPr>
-              <w:t>=</w:t>
+              <w:t>?category=</w:t>
             </w:r>
             <w:proofErr w:type="spellStart"/>
             <w:r>
@@ -6649,7 +10836,6 @@
               <w:t xml:space="preserve">{name, description, price, stock, category, </w:t>
             </w:r>
             <w:proofErr w:type="spellStart"/>
-            <w:proofErr w:type="gramStart"/>
             <w:r>
               <w:rPr>
                 <w:rFonts w:ascii="Times New Roman" w:hAnsi="Times New Roman"/>
@@ -6665,7 +10851,6 @@
               </w:rPr>
               <w:t>}`</w:t>
             </w:r>
-            <w:proofErr w:type="gramEnd"/>
           </w:p>
         </w:tc>
         <w:tc>
@@ -7216,15 +11401,7 @@
                 <w:rFonts w:ascii="Times New Roman" w:hAnsi="Times New Roman"/>
                 <w:szCs w:val="24"/>
               </w:rPr>
-              <w:t>query</w:t>
-            </w:r>
-            <w:proofErr w:type="gramStart"/>
-            <w:r>
-              <w:rPr>
-                <w:rFonts w:ascii="Times New Roman" w:hAnsi="Times New Roman"/>
-                <w:szCs w:val="24"/>
-              </w:rPr>
-              <w:t>:</w:t>
+              <w:t>query:</w:t>
             </w:r>
             <w:r>
               <w:rPr>
@@ -7249,7 +11426,6 @@
               <w:t>lat</w:t>
             </w:r>
             <w:proofErr w:type="spellEnd"/>
-            <w:proofErr w:type="gramEnd"/>
             <w:r>
               <w:rPr>
                 <w:rFonts w:ascii="Times New Roman" w:hAnsi="Times New Roman"/>

</xml_diff>